<commit_message>
feat: esto es la fe caballero
Aqui aparcar es mas dificil que pillar cita
</commit_message>
<xml_diff>
--- a/InformeMLOPS.docx
+++ b/InformeMLOPS.docx
@@ -2571,6 +2571,7 @@
         <w:t>LIMIT 10</w:t>
       </w:r>
     </w:p>
+    <w:p/>
     <w:p>
       <w:r>
         <w:br w:type="page"/>
@@ -2582,1013 +2583,10 @@
       </w:pPr>
       <w:r>
         <w:lastRenderedPageBreak/>
-        <w:t xml:space="preserve">6. Evidencias de </w:t>
-      </w:r>
-      <w:r>
-        <w:t>conversación</w:t>
-      </w:r>
-    </w:p>
-    <w:tbl>
-      <w:tblPr>
-        <w:tblW w:w="0" w:type="auto"/>
-        <w:tblInd w:w="90" w:type="dxa"/>
-        <w:tblBorders>
-          <w:top w:val="single" w:sz="4" w:space="0" w:color="D9DEE5"/>
-          <w:left w:val="single" w:sz="4" w:space="0" w:color="D9DEE5"/>
-          <w:bottom w:val="single" w:sz="4" w:space="0" w:color="D9DEE5"/>
-          <w:right w:val="single" w:sz="4" w:space="0" w:color="D9DEE5"/>
-          <w:insideH w:val="single" w:sz="4" w:space="0" w:color="D9DEE5"/>
-          <w:insideV w:val="single" w:sz="4" w:space="0" w:color="D9DEE5"/>
-        </w:tblBorders>
-        <w:tblCellMar>
-          <w:top w:w="90" w:type="dxa"/>
-          <w:left w:w="90" w:type="dxa"/>
-          <w:bottom w:w="90" w:type="dxa"/>
-          <w:right w:w="90" w:type="dxa"/>
-        </w:tblCellMar>
-        <w:tblLook w:val="0000" w:firstRow="0" w:lastRow="0" w:firstColumn="0" w:lastColumn="0" w:noHBand="0" w:noVBand="0"/>
-      </w:tblPr>
-      <w:tblGrid>
-        <w:gridCol w:w="4516"/>
-        <w:gridCol w:w="5212"/>
-      </w:tblGrid>
-      <w:tr>
-        <w:tc>
-          <w:tcPr>
-            <w:tcW w:w="9000" w:type="dxa"/>
-            <w:shd w:val="clear" w:color="auto" w:fill="EAF7FA"/>
-          </w:tcPr>
-          <w:p/>
-        </w:tc>
-        <w:tc>
-          <w:tcPr>
-            <w:tcW w:w="9000" w:type="dxa"/>
-            <w:shd w:val="clear" w:color="auto" w:fill="EAF7FA"/>
-          </w:tcPr>
-          <w:p>
-            <w:r>
-              <w:rPr>
-                <w:b/>
-              </w:rPr>
-              <w:t>Uso en ADK Web</w:t>
-            </w:r>
-          </w:p>
-          <w:p>
-            <w:r>
-              <w:t xml:space="preserve">Los siguientes paneles documentan cuatro conversaciones de demo que cubren el flujo de extremo a extremo. </w:t>
-            </w:r>
-            <w:proofErr w:type="spellStart"/>
-            <w:r>
-              <w:t>Estan</w:t>
-            </w:r>
-            <w:proofErr w:type="spellEnd"/>
-            <w:r>
-              <w:t xml:space="preserve"> redactados para reproducirse en ADK Web; en la entrega final pueden </w:t>
-            </w:r>
-            <w:proofErr w:type="spellStart"/>
-            <w:r>
-              <w:t>acompanarse</w:t>
-            </w:r>
-            <w:proofErr w:type="spellEnd"/>
-            <w:r>
-              <w:t xml:space="preserve"> de capturas reales de pantalla.</w:t>
-            </w:r>
-          </w:p>
-        </w:tc>
-      </w:tr>
-    </w:tbl>
-    <w:p/>
-    <w:p>
-      <w:pPr>
-        <w:pStyle w:val="Ttulo2"/>
-      </w:pPr>
-      <w:r>
-        <w:t xml:space="preserve">Captura 1 - Ranking de </w:t>
-      </w:r>
-      <w:r>
-        <w:t>categorías</w:t>
-      </w:r>
-    </w:p>
-    <w:p>
-      <w:r>
-        <w:t xml:space="preserve">Muestra que el supervisor delega una pregunta de </w:t>
-      </w:r>
-      <w:r>
-        <w:t>métricas</w:t>
-      </w:r>
-      <w:r>
-        <w:t xml:space="preserve"> al </w:t>
-      </w:r>
-      <w:proofErr w:type="spellStart"/>
-      <w:r>
-        <w:t>BigQuery</w:t>
-      </w:r>
-      <w:proofErr w:type="spellEnd"/>
-      <w:r>
-        <w:t xml:space="preserve"> </w:t>
-      </w:r>
-      <w:proofErr w:type="spellStart"/>
-      <w:r>
-        <w:t>Analyst</w:t>
-      </w:r>
-      <w:proofErr w:type="spellEnd"/>
-      <w:r>
-        <w:t xml:space="preserve"> </w:t>
-      </w:r>
-      <w:proofErr w:type="spellStart"/>
-      <w:r>
-        <w:t>Agent</w:t>
-      </w:r>
-      <w:proofErr w:type="spellEnd"/>
-      <w:r>
-        <w:t xml:space="preserve"> y que la respuesta queda fundamentada en SQL.</w:t>
-      </w:r>
-    </w:p>
-    <w:tbl>
-      <w:tblPr>
-        <w:tblW w:w="0" w:type="auto"/>
-        <w:tblInd w:w="90" w:type="dxa"/>
-        <w:tblBorders>
-          <w:top w:val="single" w:sz="4" w:space="0" w:color="D9DEE5"/>
-          <w:left w:val="single" w:sz="4" w:space="0" w:color="D9DEE5"/>
-          <w:bottom w:val="single" w:sz="4" w:space="0" w:color="D9DEE5"/>
-          <w:right w:val="single" w:sz="4" w:space="0" w:color="D9DEE5"/>
-          <w:insideH w:val="single" w:sz="4" w:space="0" w:color="D9DEE5"/>
-          <w:insideV w:val="single" w:sz="4" w:space="0" w:color="D9DEE5"/>
-        </w:tblBorders>
-        <w:tblCellMar>
-          <w:top w:w="90" w:type="dxa"/>
-          <w:left w:w="90" w:type="dxa"/>
-          <w:bottom w:w="90" w:type="dxa"/>
-          <w:right w:w="90" w:type="dxa"/>
-        </w:tblCellMar>
-        <w:tblLook w:val="0000" w:firstRow="0" w:lastRow="0" w:firstColumn="0" w:lastColumn="0" w:noHBand="0" w:noVBand="0"/>
-      </w:tblPr>
-      <w:tblGrid>
-        <w:gridCol w:w="1800"/>
-        <w:gridCol w:w="7200"/>
-      </w:tblGrid>
-      <w:tr>
-        <w:tc>
-          <w:tcPr>
-            <w:tcW w:w="1800" w:type="dxa"/>
-            <w:shd w:val="clear" w:color="auto" w:fill="123447"/>
-          </w:tcPr>
-          <w:p>
-            <w:r>
-              <w:rPr>
-                <w:b/>
-              </w:rPr>
-              <w:t>Interlocutor</w:t>
-            </w:r>
-          </w:p>
-        </w:tc>
-        <w:tc>
-          <w:tcPr>
-            <w:tcW w:w="7200" w:type="dxa"/>
-            <w:shd w:val="clear" w:color="auto" w:fill="123447"/>
-          </w:tcPr>
-          <w:p>
-            <w:r>
-              <w:rPr>
-                <w:b/>
-              </w:rPr>
-              <w:t>Mensaje</w:t>
-            </w:r>
-          </w:p>
-        </w:tc>
-      </w:tr>
-      <w:tr>
-        <w:tc>
-          <w:tcPr>
-            <w:tcW w:w="1800" w:type="dxa"/>
-          </w:tcPr>
-          <w:p>
-            <w:r>
-              <w:t>Usuario</w:t>
-            </w:r>
-          </w:p>
-        </w:tc>
-        <w:tc>
-          <w:tcPr>
-            <w:tcW w:w="7200" w:type="dxa"/>
-          </w:tcPr>
-          <w:p>
-            <w:r>
-              <w:t>¿Cuáles son las 10 categorías con más ingresos?</w:t>
-            </w:r>
-          </w:p>
-        </w:tc>
-      </w:tr>
-      <w:tr>
-        <w:tc>
-          <w:tcPr>
-            <w:tcW w:w="1800" w:type="dxa"/>
-          </w:tcPr>
-          <w:p>
-            <w:r>
-              <w:t>Agente</w:t>
-            </w:r>
-          </w:p>
-        </w:tc>
-        <w:tc>
-          <w:tcPr>
-            <w:tcW w:w="7200" w:type="dxa"/>
-          </w:tcPr>
-          <w:p>
-            <w:r>
-              <w:t xml:space="preserve">Uso </w:t>
-            </w:r>
-            <w:proofErr w:type="spellStart"/>
-            <w:r>
-              <w:t>bigquery_analyst_agent</w:t>
-            </w:r>
-            <w:proofErr w:type="spellEnd"/>
-            <w:r>
-              <w:t xml:space="preserve"> porque la consulta requiere datos de ventas por </w:t>
-            </w:r>
-            <w:r>
-              <w:t>categoría</w:t>
-            </w:r>
-            <w:r>
-              <w:t>.</w:t>
-            </w:r>
-          </w:p>
-        </w:tc>
-      </w:tr>
-      <w:tr>
-        <w:tc>
-          <w:tcPr>
-            <w:tcW w:w="1800" w:type="dxa"/>
-          </w:tcPr>
-          <w:p>
-            <w:r>
-              <w:t>Agente</w:t>
-            </w:r>
-          </w:p>
-        </w:tc>
-        <w:tc>
-          <w:tcPr>
-            <w:tcW w:w="7200" w:type="dxa"/>
-          </w:tcPr>
-          <w:p>
-            <w:r>
-              <w:t xml:space="preserve">SQL usado: </w:t>
-            </w:r>
-            <w:proofErr w:type="spellStart"/>
-            <w:r>
-              <w:t>order_items</w:t>
-            </w:r>
-            <w:proofErr w:type="spellEnd"/>
-            <w:r>
-              <w:t xml:space="preserve"> JOIN </w:t>
-            </w:r>
-            <w:proofErr w:type="spellStart"/>
-            <w:r>
-              <w:t>products</w:t>
-            </w:r>
-            <w:proofErr w:type="spellEnd"/>
-            <w:r>
-              <w:t xml:space="preserve">, </w:t>
-            </w:r>
-            <w:proofErr w:type="gramStart"/>
-            <w:r>
-              <w:t>status</w:t>
-            </w:r>
-            <w:proofErr w:type="gramEnd"/>
-            <w:r>
-              <w:t xml:space="preserve">='Complete', GROUP BY </w:t>
-            </w:r>
-            <w:proofErr w:type="spellStart"/>
-            <w:r>
-              <w:t>category</w:t>
-            </w:r>
-            <w:proofErr w:type="spellEnd"/>
-            <w:r>
-              <w:t xml:space="preserve">, ORDER BY </w:t>
-            </w:r>
-            <w:proofErr w:type="spellStart"/>
-            <w:r>
-              <w:t>total_revenue</w:t>
-            </w:r>
-            <w:proofErr w:type="spellEnd"/>
-            <w:r>
-              <w:t xml:space="preserve"> DESC, LIMIT 10. Resumo ranking, pedidos, unidades e ingresos sin inventar margen.</w:t>
-            </w:r>
-          </w:p>
-        </w:tc>
-      </w:tr>
-    </w:tbl>
-    <w:p/>
-    <w:p>
-      <w:pPr>
-        <w:pStyle w:val="Ttulo2"/>
-      </w:pPr>
-      <w:r>
-        <w:t xml:space="preserve">Captura 2 - </w:t>
-      </w:r>
-      <w:r>
-        <w:t>Análisis</w:t>
-      </w:r>
-      <w:r>
-        <w:t xml:space="preserve"> por </w:t>
-      </w:r>
-      <w:r>
-        <w:t>país</w:t>
-      </w:r>
-      <w:r>
-        <w:t xml:space="preserve"> y </w:t>
-      </w:r>
-      <w:r>
-        <w:t>recomendación</w:t>
-      </w:r>
-    </w:p>
-    <w:p>
-      <w:r>
-        <w:t xml:space="preserve">Demuestra </w:t>
-      </w:r>
-      <w:r>
-        <w:t>coordinación</w:t>
-      </w:r>
-      <w:r>
-        <w:t xml:space="preserve"> multiagente: primero se obtienen datos y </w:t>
-      </w:r>
-      <w:r>
-        <w:t>después</w:t>
-      </w:r>
-      <w:r>
-        <w:t xml:space="preserve"> se solicita </w:t>
-      </w:r>
-      <w:r>
-        <w:t>interpretación</w:t>
-      </w:r>
-      <w:r>
-        <w:t xml:space="preserve"> comercial.</w:t>
-      </w:r>
-    </w:p>
-    <w:tbl>
-      <w:tblPr>
-        <w:tblW w:w="0" w:type="auto"/>
-        <w:tblInd w:w="90" w:type="dxa"/>
-        <w:tblBorders>
-          <w:top w:val="single" w:sz="4" w:space="0" w:color="D9DEE5"/>
-          <w:left w:val="single" w:sz="4" w:space="0" w:color="D9DEE5"/>
-          <w:bottom w:val="single" w:sz="4" w:space="0" w:color="D9DEE5"/>
-          <w:right w:val="single" w:sz="4" w:space="0" w:color="D9DEE5"/>
-          <w:insideH w:val="single" w:sz="4" w:space="0" w:color="D9DEE5"/>
-          <w:insideV w:val="single" w:sz="4" w:space="0" w:color="D9DEE5"/>
-        </w:tblBorders>
-        <w:tblCellMar>
-          <w:top w:w="90" w:type="dxa"/>
-          <w:left w:w="90" w:type="dxa"/>
-          <w:bottom w:w="90" w:type="dxa"/>
-          <w:right w:w="90" w:type="dxa"/>
-        </w:tblCellMar>
-        <w:tblLook w:val="0000" w:firstRow="0" w:lastRow="0" w:firstColumn="0" w:lastColumn="0" w:noHBand="0" w:noVBand="0"/>
-      </w:tblPr>
-      <w:tblGrid>
-        <w:gridCol w:w="1800"/>
-        <w:gridCol w:w="7200"/>
-      </w:tblGrid>
-      <w:tr>
-        <w:tc>
-          <w:tcPr>
-            <w:tcW w:w="1800" w:type="dxa"/>
-            <w:shd w:val="clear" w:color="auto" w:fill="123447"/>
-          </w:tcPr>
-          <w:p>
-            <w:r>
-              <w:rPr>
-                <w:b/>
-              </w:rPr>
-              <w:t>Interlocutor</w:t>
-            </w:r>
-          </w:p>
-        </w:tc>
-        <w:tc>
-          <w:tcPr>
-            <w:tcW w:w="7200" w:type="dxa"/>
-            <w:shd w:val="clear" w:color="auto" w:fill="123447"/>
-          </w:tcPr>
-          <w:p>
-            <w:r>
-              <w:rPr>
-                <w:b/>
-              </w:rPr>
-              <w:t>Mensaje</w:t>
-            </w:r>
-          </w:p>
-        </w:tc>
-      </w:tr>
-      <w:tr>
-        <w:tc>
-          <w:tcPr>
-            <w:tcW w:w="1800" w:type="dxa"/>
-          </w:tcPr>
-          <w:p>
-            <w:r>
-              <w:t>Usuario</w:t>
-            </w:r>
-          </w:p>
-        </w:tc>
-        <w:tc>
-          <w:tcPr>
-            <w:tcW w:w="7200" w:type="dxa"/>
-          </w:tcPr>
-          <w:p>
-            <w:r>
-              <w:t xml:space="preserve">Analiza las ventas por </w:t>
-            </w:r>
-            <w:r>
-              <w:t>país</w:t>
-            </w:r>
-            <w:r>
-              <w:t xml:space="preserve"> y dime en que mercados </w:t>
-            </w:r>
-            <w:r>
-              <w:t>invertirías</w:t>
-            </w:r>
-            <w:r>
-              <w:t xml:space="preserve"> </w:t>
-            </w:r>
-            <w:r>
-              <w:t>más</w:t>
-            </w:r>
-            <w:r>
-              <w:t>.</w:t>
-            </w:r>
-          </w:p>
-        </w:tc>
-      </w:tr>
-      <w:tr>
-        <w:tc>
-          <w:tcPr>
-            <w:tcW w:w="1800" w:type="dxa"/>
-          </w:tcPr>
-          <w:p>
-            <w:r>
-              <w:t>Agente</w:t>
-            </w:r>
-          </w:p>
-        </w:tc>
-        <w:tc>
-          <w:tcPr>
-            <w:tcW w:w="7200" w:type="dxa"/>
-          </w:tcPr>
-          <w:p>
-            <w:r>
-              <w:t xml:space="preserve">Llamo a </w:t>
-            </w:r>
-            <w:proofErr w:type="spellStart"/>
-            <w:r>
-              <w:t>BigQuery</w:t>
-            </w:r>
-            <w:proofErr w:type="spellEnd"/>
-            <w:r>
-              <w:t xml:space="preserve"> </w:t>
-            </w:r>
-            <w:proofErr w:type="spellStart"/>
-            <w:r>
-              <w:t>Analyst</w:t>
-            </w:r>
-            <w:proofErr w:type="spellEnd"/>
-            <w:r>
-              <w:t xml:space="preserve"> para </w:t>
-            </w:r>
-            <w:proofErr w:type="spellStart"/>
-            <w:r>
-              <w:t>total_orders</w:t>
-            </w:r>
-            <w:proofErr w:type="spellEnd"/>
-            <w:r>
-              <w:t xml:space="preserve">, </w:t>
-            </w:r>
-            <w:proofErr w:type="spellStart"/>
-            <w:r>
-              <w:t>total_customers</w:t>
-            </w:r>
-            <w:proofErr w:type="spellEnd"/>
-            <w:r>
-              <w:t xml:space="preserve">, </w:t>
-            </w:r>
-            <w:proofErr w:type="spellStart"/>
-            <w:r>
-              <w:t>total_revenue</w:t>
-            </w:r>
-            <w:proofErr w:type="spellEnd"/>
-            <w:r>
-              <w:t xml:space="preserve"> y </w:t>
-            </w:r>
-            <w:proofErr w:type="spellStart"/>
-            <w:r>
-              <w:t>avg_order_value</w:t>
-            </w:r>
-            <w:proofErr w:type="spellEnd"/>
-            <w:r>
-              <w:t xml:space="preserve"> por </w:t>
-            </w:r>
-            <w:proofErr w:type="spellStart"/>
-            <w:r>
-              <w:t>pais</w:t>
-            </w:r>
-            <w:proofErr w:type="spellEnd"/>
-            <w:r>
-              <w:t>.</w:t>
-            </w:r>
-          </w:p>
-        </w:tc>
-      </w:tr>
-      <w:tr>
-        <w:tc>
-          <w:tcPr>
-            <w:tcW w:w="1800" w:type="dxa"/>
-          </w:tcPr>
-          <w:p>
-            <w:r>
-              <w:t>Agente</w:t>
-            </w:r>
-          </w:p>
-        </w:tc>
-        <w:tc>
-          <w:tcPr>
-            <w:tcW w:w="7200" w:type="dxa"/>
-          </w:tcPr>
-          <w:p>
-            <w:r>
-              <w:t xml:space="preserve">Paso los resultados al Business </w:t>
-            </w:r>
-            <w:proofErr w:type="spellStart"/>
-            <w:r>
-              <w:t>Consultant</w:t>
-            </w:r>
-            <w:proofErr w:type="spellEnd"/>
-            <w:r>
-              <w:t>. Se separan hallazgos, oportunidades, riesgos y recomendaciones, avisando que no hay datos de CAC ni margen neto.</w:t>
-            </w:r>
-          </w:p>
-        </w:tc>
-      </w:tr>
-    </w:tbl>
-    <w:p/>
-    <w:p>
-      <w:r>
-        <w:br w:type="page"/>
-      </w:r>
-    </w:p>
-    <w:p>
-      <w:pPr>
-        <w:pStyle w:val="Ttulo1"/>
-      </w:pPr>
-      <w:r>
-        <w:lastRenderedPageBreak/>
-        <w:t>7. Evidencias MCP y fallo controlado</w:t>
-      </w:r>
-    </w:p>
-    <w:p>
-      <w:pPr>
-        <w:pStyle w:val="Ttulo2"/>
-      </w:pPr>
-      <w:r>
-        <w:t xml:space="preserve">Captura 3 - </w:t>
-      </w:r>
-      <w:r>
-        <w:t>Generación</w:t>
-      </w:r>
-      <w:r>
-        <w:t xml:space="preserve"> de informe</w:t>
-      </w:r>
-    </w:p>
-    <w:p>
-      <w:r>
-        <w:t xml:space="preserve">Muestra la herramienta MCP </w:t>
-      </w:r>
-      <w:proofErr w:type="spellStart"/>
-      <w:r>
-        <w:t>create_business_report</w:t>
-      </w:r>
-      <w:proofErr w:type="spellEnd"/>
-      <w:r>
-        <w:t xml:space="preserve"> creando un artefacto </w:t>
-      </w:r>
-      <w:proofErr w:type="spellStart"/>
-      <w:r>
-        <w:t>Markdown</w:t>
-      </w:r>
-      <w:proofErr w:type="spellEnd"/>
-      <w:r>
-        <w:t xml:space="preserve"> con la pregunta, SQL, hallazgos y recomendaciones.</w:t>
-      </w:r>
-    </w:p>
-    <w:tbl>
-      <w:tblPr>
-        <w:tblW w:w="0" w:type="auto"/>
-        <w:tblInd w:w="90" w:type="dxa"/>
-        <w:tblBorders>
-          <w:top w:val="single" w:sz="4" w:space="0" w:color="D9DEE5"/>
-          <w:left w:val="single" w:sz="4" w:space="0" w:color="D9DEE5"/>
-          <w:bottom w:val="single" w:sz="4" w:space="0" w:color="D9DEE5"/>
-          <w:right w:val="single" w:sz="4" w:space="0" w:color="D9DEE5"/>
-          <w:insideH w:val="single" w:sz="4" w:space="0" w:color="D9DEE5"/>
-          <w:insideV w:val="single" w:sz="4" w:space="0" w:color="D9DEE5"/>
-        </w:tblBorders>
-        <w:tblCellMar>
-          <w:top w:w="90" w:type="dxa"/>
-          <w:left w:w="90" w:type="dxa"/>
-          <w:bottom w:w="90" w:type="dxa"/>
-          <w:right w:w="90" w:type="dxa"/>
-        </w:tblCellMar>
-        <w:tblLook w:val="0000" w:firstRow="0" w:lastRow="0" w:firstColumn="0" w:lastColumn="0" w:noHBand="0" w:noVBand="0"/>
-      </w:tblPr>
-      <w:tblGrid>
-        <w:gridCol w:w="1800"/>
-        <w:gridCol w:w="7200"/>
-      </w:tblGrid>
-      <w:tr>
-        <w:tc>
-          <w:tcPr>
-            <w:tcW w:w="1800" w:type="dxa"/>
-            <w:shd w:val="clear" w:color="auto" w:fill="123447"/>
-          </w:tcPr>
-          <w:p>
-            <w:r>
-              <w:rPr>
-                <w:b/>
-              </w:rPr>
-              <w:t>Interlocutor</w:t>
-            </w:r>
-          </w:p>
-        </w:tc>
-        <w:tc>
-          <w:tcPr>
-            <w:tcW w:w="7200" w:type="dxa"/>
-            <w:shd w:val="clear" w:color="auto" w:fill="123447"/>
-          </w:tcPr>
-          <w:p>
-            <w:r>
-              <w:rPr>
-                <w:b/>
-              </w:rPr>
-              <w:t>Mensaje</w:t>
-            </w:r>
-          </w:p>
-        </w:tc>
-      </w:tr>
-      <w:tr>
-        <w:tc>
-          <w:tcPr>
-            <w:tcW w:w="1800" w:type="dxa"/>
-          </w:tcPr>
-          <w:p>
-            <w:r>
-              <w:t>Usuario</w:t>
-            </w:r>
-          </w:p>
-        </w:tc>
-        <w:tc>
-          <w:tcPr>
-            <w:tcW w:w="7200" w:type="dxa"/>
-          </w:tcPr>
-          <w:p>
-            <w:r>
-              <w:t>Genera un informe ejecutivo con estos hallazgos.</w:t>
-            </w:r>
-          </w:p>
-        </w:tc>
-      </w:tr>
-      <w:tr>
-        <w:tc>
-          <w:tcPr>
-            <w:tcW w:w="1800" w:type="dxa"/>
-          </w:tcPr>
-          <w:p>
-            <w:r>
-              <w:t>Agente</w:t>
-            </w:r>
-          </w:p>
-        </w:tc>
-        <w:tc>
-          <w:tcPr>
-            <w:tcW w:w="7200" w:type="dxa"/>
-          </w:tcPr>
-          <w:p>
-            <w:r>
-              <w:t xml:space="preserve">Invoco MCP </w:t>
-            </w:r>
-            <w:proofErr w:type="spellStart"/>
-            <w:r>
-              <w:t>Reporting</w:t>
-            </w:r>
-            <w:proofErr w:type="spellEnd"/>
-            <w:r>
-              <w:t xml:space="preserve"> Server: </w:t>
-            </w:r>
-            <w:proofErr w:type="spellStart"/>
-            <w:r>
-              <w:t>create_business_</w:t>
-            </w:r>
-            <w:proofErr w:type="gramStart"/>
-            <w:r>
-              <w:t>report</w:t>
-            </w:r>
-            <w:proofErr w:type="spellEnd"/>
-            <w:r>
-              <w:t>(</w:t>
-            </w:r>
-            <w:proofErr w:type="spellStart"/>
-            <w:proofErr w:type="gramEnd"/>
-            <w:r>
-              <w:t>title</w:t>
-            </w:r>
-            <w:proofErr w:type="spellEnd"/>
-            <w:r>
-              <w:t xml:space="preserve">, </w:t>
-            </w:r>
-            <w:proofErr w:type="spellStart"/>
-            <w:r>
-              <w:t>question</w:t>
-            </w:r>
-            <w:proofErr w:type="spellEnd"/>
-            <w:r>
-              <w:t xml:space="preserve">, </w:t>
-            </w:r>
-            <w:proofErr w:type="spellStart"/>
-            <w:r>
-              <w:t>sql_used</w:t>
-            </w:r>
-            <w:proofErr w:type="spellEnd"/>
-            <w:r>
-              <w:t xml:space="preserve">, </w:t>
-            </w:r>
-            <w:proofErr w:type="spellStart"/>
-            <w:r>
-              <w:t>key_findings</w:t>
-            </w:r>
-            <w:proofErr w:type="spellEnd"/>
-            <w:r>
-              <w:t xml:space="preserve">, </w:t>
-            </w:r>
-            <w:proofErr w:type="spellStart"/>
-            <w:r>
-              <w:t>recommendations</w:t>
-            </w:r>
-            <w:proofErr w:type="spellEnd"/>
-            <w:r>
-              <w:t xml:space="preserve">, </w:t>
-            </w:r>
-            <w:proofErr w:type="spellStart"/>
-            <w:r>
-              <w:t>limitations</w:t>
-            </w:r>
-            <w:proofErr w:type="spellEnd"/>
-            <w:r>
-              <w:t>).</w:t>
-            </w:r>
-          </w:p>
-        </w:tc>
-      </w:tr>
-      <w:tr>
-        <w:tc>
-          <w:tcPr>
-            <w:tcW w:w="1800" w:type="dxa"/>
-          </w:tcPr>
-          <w:p>
-            <w:r>
-              <w:t>Agente</w:t>
-            </w:r>
-          </w:p>
-        </w:tc>
-        <w:tc>
-          <w:tcPr>
-            <w:tcW w:w="7200" w:type="dxa"/>
-          </w:tcPr>
-          <w:p>
-            <w:r>
-              <w:t xml:space="preserve">Informe creado en </w:t>
-            </w:r>
-            <w:proofErr w:type="spellStart"/>
-            <w:r>
-              <w:t>reports</w:t>
-            </w:r>
-            <w:proofErr w:type="spellEnd"/>
-            <w:r>
-              <w:t>/</w:t>
-            </w:r>
-            <w:proofErr w:type="spellStart"/>
-            <w:r>
-              <w:t>generated</w:t>
-            </w:r>
-            <w:proofErr w:type="spellEnd"/>
-            <w:r>
-              <w:t>/&lt;</w:t>
-            </w:r>
-            <w:proofErr w:type="spellStart"/>
-            <w:r>
-              <w:t>timestamp</w:t>
-            </w:r>
-            <w:proofErr w:type="spellEnd"/>
-            <w:r>
-              <w:t>&gt;-&lt;slug&gt;.</w:t>
-            </w:r>
-            <w:proofErr w:type="spellStart"/>
-            <w:r>
-              <w:t>md</w:t>
-            </w:r>
-            <w:proofErr w:type="spellEnd"/>
-            <w:r>
-              <w:t xml:space="preserve">. El artefacto incluye </w:t>
-            </w:r>
-            <w:proofErr w:type="spellStart"/>
-            <w:r>
-              <w:t>metadata</w:t>
-            </w:r>
-            <w:proofErr w:type="spellEnd"/>
-            <w:r>
-              <w:t xml:space="preserve"> para trazabilidad.</w:t>
-            </w:r>
-          </w:p>
-        </w:tc>
-      </w:tr>
-    </w:tbl>
-    <w:p/>
-    <w:p>
-      <w:pPr>
-        <w:pStyle w:val="Ttulo2"/>
-      </w:pPr>
-      <w:r>
-        <w:t xml:space="preserve">Captura 4 - </w:t>
-      </w:r>
-      <w:r>
-        <w:t>Petición</w:t>
-      </w:r>
-      <w:r>
-        <w:t xml:space="preserve"> peligrosa</w:t>
-      </w:r>
-    </w:p>
-    <w:p>
-      <w:r>
-        <w:t>Caso de fallo gestionado con elegancia: el usuario solicita modificar datos y el sistema ofrece una alternativa de solo lectura.</w:t>
-      </w:r>
-    </w:p>
-    <w:tbl>
-      <w:tblPr>
-        <w:tblW w:w="0" w:type="auto"/>
-        <w:tblInd w:w="90" w:type="dxa"/>
-        <w:tblBorders>
-          <w:top w:val="single" w:sz="4" w:space="0" w:color="D9DEE5"/>
-          <w:left w:val="single" w:sz="4" w:space="0" w:color="D9DEE5"/>
-          <w:bottom w:val="single" w:sz="4" w:space="0" w:color="D9DEE5"/>
-          <w:right w:val="single" w:sz="4" w:space="0" w:color="D9DEE5"/>
-          <w:insideH w:val="single" w:sz="4" w:space="0" w:color="D9DEE5"/>
-          <w:insideV w:val="single" w:sz="4" w:space="0" w:color="D9DEE5"/>
-        </w:tblBorders>
-        <w:tblCellMar>
-          <w:top w:w="90" w:type="dxa"/>
-          <w:left w:w="90" w:type="dxa"/>
-          <w:bottom w:w="90" w:type="dxa"/>
-          <w:right w:w="90" w:type="dxa"/>
-        </w:tblCellMar>
-        <w:tblLook w:val="0000" w:firstRow="0" w:lastRow="0" w:firstColumn="0" w:lastColumn="0" w:noHBand="0" w:noVBand="0"/>
-      </w:tblPr>
-      <w:tblGrid>
-        <w:gridCol w:w="1800"/>
-        <w:gridCol w:w="7200"/>
-      </w:tblGrid>
-      <w:tr>
-        <w:tc>
-          <w:tcPr>
-            <w:tcW w:w="1800" w:type="dxa"/>
-            <w:shd w:val="clear" w:color="auto" w:fill="123447"/>
-          </w:tcPr>
-          <w:p>
-            <w:r>
-              <w:rPr>
-                <w:b/>
-              </w:rPr>
-              <w:t>Interlocutor</w:t>
-            </w:r>
-          </w:p>
-        </w:tc>
-        <w:tc>
-          <w:tcPr>
-            <w:tcW w:w="7200" w:type="dxa"/>
-            <w:shd w:val="clear" w:color="auto" w:fill="123447"/>
-          </w:tcPr>
-          <w:p>
-            <w:r>
-              <w:rPr>
-                <w:b/>
-              </w:rPr>
-              <w:t>Mensaje</w:t>
-            </w:r>
-          </w:p>
-        </w:tc>
-      </w:tr>
-      <w:tr>
-        <w:tc>
-          <w:tcPr>
-            <w:tcW w:w="1800" w:type="dxa"/>
-          </w:tcPr>
-          <w:p>
-            <w:r>
-              <w:t>Usuario</w:t>
-            </w:r>
-          </w:p>
-        </w:tc>
-        <w:tc>
-          <w:tcPr>
-            <w:tcW w:w="7200" w:type="dxa"/>
-          </w:tcPr>
-          <w:p>
-            <w:r>
-              <w:t>Borra todos los pedidos cancelados de la base de datos.</w:t>
-            </w:r>
-          </w:p>
-        </w:tc>
-      </w:tr>
-      <w:tr>
-        <w:tc>
-          <w:tcPr>
-            <w:tcW w:w="1800" w:type="dxa"/>
-          </w:tcPr>
-          <w:p>
-            <w:r>
-              <w:t>Agente</w:t>
-            </w:r>
-          </w:p>
-        </w:tc>
-        <w:tc>
-          <w:tcPr>
-            <w:tcW w:w="7200" w:type="dxa"/>
-          </w:tcPr>
-          <w:p>
-            <w:r>
-              <w:t xml:space="preserve">No puedo borrar ni modificar datos. Este asistente solo permite </w:t>
-            </w:r>
-            <w:r>
-              <w:t>análisis</w:t>
-            </w:r>
-            <w:r>
-              <w:t xml:space="preserve"> de lectura sobre </w:t>
-            </w:r>
-            <w:proofErr w:type="spellStart"/>
-            <w:r>
-              <w:t>BigQuery</w:t>
-            </w:r>
-            <w:proofErr w:type="spellEnd"/>
-            <w:r>
-              <w:t>.</w:t>
-            </w:r>
-          </w:p>
-        </w:tc>
-      </w:tr>
-      <w:tr>
-        <w:tc>
-          <w:tcPr>
-            <w:tcW w:w="1800" w:type="dxa"/>
-          </w:tcPr>
-          <w:p>
-            <w:r>
-              <w:t>Agente</w:t>
-            </w:r>
-          </w:p>
-        </w:tc>
-        <w:tc>
-          <w:tcPr>
-            <w:tcW w:w="7200" w:type="dxa"/>
-          </w:tcPr>
-          <w:p>
-            <w:r>
-              <w:t xml:space="preserve">Alternativa segura: puedo analizar el porcentaje de pedidos cancelados, identificar patrones por </w:t>
-            </w:r>
-            <w:r>
-              <w:t>país</w:t>
-            </w:r>
-            <w:r>
-              <w:t xml:space="preserve"> o </w:t>
-            </w:r>
-            <w:r>
-              <w:t>categoría</w:t>
-            </w:r>
-            <w:r>
-              <w:t xml:space="preserve"> y generar un informe con recomendaciones.</w:t>
-            </w:r>
-          </w:p>
-        </w:tc>
-      </w:tr>
-    </w:tbl>
-    <w:p/>
-    <w:p>
-      <w:r>
-        <w:br w:type="page"/>
-      </w:r>
-    </w:p>
-    <w:p>
-      <w:pPr>
-        <w:pStyle w:val="Ttulo1"/>
-      </w:pPr>
-      <w:r>
-        <w:lastRenderedPageBreak/>
-        <w:t xml:space="preserve">8. </w:t>
+        <w:t>6</w:t>
+      </w:r>
+      <w:r>
+        <w:t xml:space="preserve">. </w:t>
       </w:r>
       <w:r>
         <w:t>Evaluación</w:t>
@@ -4015,7 +3013,10 @@
       </w:pPr>
       <w:r>
         <w:lastRenderedPageBreak/>
-        <w:t>9. Limitaciones y trabajo futuro</w:t>
+        <w:t>7</w:t>
+      </w:r>
+      <w:r>
+        <w:t>. Limitaciones y trabajo futuro</w:t>
       </w:r>
     </w:p>
     <w:tbl>
@@ -4590,7 +3591,10 @@
       </w:pPr>
       <w:r>
         <w:lastRenderedPageBreak/>
-        <w:t xml:space="preserve">10. </w:t>
+        <w:t>8</w:t>
+      </w:r>
+      <w:r>
+        <w:t xml:space="preserve">. </w:t>
       </w:r>
       <w:r>
         <w:t>Guía</w:t>

</xml_diff>

<commit_message>
fix: final fixes to documentation
</commit_message>
<xml_diff>
--- a/InformeMLOPS.docx
+++ b/InformeMLOPS.docx
@@ -1,6 +1,6 @@
 
 <file path=word/document.xml><?xml version="1.0" encoding="utf-8"?>
-<w:document xmlns:wpc="http://schemas.microsoft.com/office/word/2010/wordprocessingCanvas" xmlns:cx="http://schemas.microsoft.com/office/drawing/2014/chartex" xmlns:cx1="http://schemas.microsoft.com/office/drawing/2015/9/8/chartex" xmlns:cx2="http://schemas.microsoft.com/office/drawing/2015/10/21/chartex" xmlns:cx3="http://schemas.microsoft.com/office/drawing/2016/5/9/chartex" xmlns:cx4="http://schemas.microsoft.com/office/drawing/2016/5/10/chartex" xmlns:cx5="http://schemas.microsoft.com/office/drawing/2016/5/11/chartex" xmlns:cx6="http://schemas.microsoft.com/office/drawing/2016/5/12/chartex" xmlns:cx7="http://schemas.microsoft.com/office/drawing/2016/5/13/chartex" xmlns:cx8="http://schemas.microsoft.com/office/drawing/2016/5/14/chartex" xmlns:mc="http://schemas.openxmlformats.org/markup-compatibility/2006" xmlns:aink="http://schemas.microsoft.com/office/drawing/2016/ink" xmlns:am3d="http://schemas.microsoft.com/office/drawing/2017/model3d" xmlns:o="urn:schemas-microsoft-com:office:office" xmlns:oel="http://schemas.microsoft.com/office/2019/extlst" xmlns:r="http://schemas.openxmlformats.org/officeDocument/2006/relationships" xmlns:m="http://schemas.openxmlformats.org/officeDocument/2006/math" xmlns:v="urn:schemas-microsoft-com:vml" xmlns:wp14="http://schemas.microsoft.com/office/word/2010/wordprocessingDrawing" xmlns:wp="http://schemas.openxmlformats.org/drawingml/2006/wordprocessingDrawing" xmlns:w10="urn:schemas-microsoft-com:office:word" xmlns:w="http://schemas.openxmlformats.org/wordprocessingml/2006/main" xmlns:w14="http://schemas.microsoft.com/office/word/2010/wordml" xmlns:w15="http://schemas.microsoft.com/office/word/2012/wordml" xmlns:w16cex="http://schemas.microsoft.com/office/word/2018/wordml/cex" xmlns:w16cid="http://schemas.microsoft.com/office/word/2016/wordml/cid" xmlns:w16="http://schemas.microsoft.com/office/word/2018/wordml" xmlns:w16du="http://schemas.microsoft.com/office/word/2023/wordml/word16du" xmlns:w16sdtdh="http://schemas.microsoft.com/office/word/2020/wordml/sdtdatahash" xmlns:w16sdtfl="http://schemas.microsoft.com/office/word/2024/wordml/sdtformatlock" xmlns:w16se="http://schemas.microsoft.com/office/word/2015/wordml/symex" xmlns:wpg="http://schemas.microsoft.com/office/word/2010/wordprocessingGroup" xmlns:wpi="http://schemas.microsoft.com/office/word/2010/wordprocessingInk" xmlns:wne="http://schemas.microsoft.com/office/word/2006/wordml" xmlns:wps="http://schemas.microsoft.com/office/word/2010/wordprocessingShape" mc:Ignorable="w14 w15 w16se w16cid w16 w16cex w16sdtdh w16sdtfl w16du wp14">
+<w:document xmlns:wpc="http://schemas.microsoft.com/office/word/2010/wordprocessingCanvas" xmlns:cx="http://schemas.microsoft.com/office/drawing/2014/chartex" xmlns:cx1="http://schemas.microsoft.com/office/drawing/2015/9/8/chartex" xmlns:cx2="http://schemas.microsoft.com/office/drawing/2015/10/21/chartex" xmlns:cx3="http://schemas.microsoft.com/office/drawing/2016/5/9/chartex" xmlns:cx4="http://schemas.microsoft.com/office/drawing/2016/5/10/chartex" xmlns:cx5="http://schemas.microsoft.com/office/drawing/2016/5/11/chartex" xmlns:cx6="http://schemas.microsoft.com/office/drawing/2016/5/12/chartex" xmlns:cx7="http://schemas.microsoft.com/office/drawing/2016/5/13/chartex" xmlns:cx8="http://schemas.microsoft.com/office/drawing/2016/5/14/chartex" xmlns:mc="http://schemas.openxmlformats.org/markup-compatibility/2006" xmlns:aink="http://schemas.microsoft.com/office/drawing/2016/ink" xmlns:am3d="http://schemas.microsoft.com/office/drawing/2017/model3d" xmlns:o="urn:schemas-microsoft-com:office:office" xmlns:oel="http://schemas.microsoft.com/office/2019/extlst" xmlns:r="http://schemas.openxmlformats.org/officeDocument/2006/relationships" xmlns:m="http://schemas.openxmlformats.org/officeDocument/2006/math" xmlns:v="urn:schemas-microsoft-com:vml" xmlns:wp14="http://schemas.microsoft.com/office/word/2010/wordprocessingDrawing" xmlns:wp="http://schemas.openxmlformats.org/drawingml/2006/wordprocessingDrawing" xmlns:w10="urn:schemas-microsoft-com:office:word" xmlns:w="http://schemas.openxmlformats.org/wordprocessingml/2006/main" xmlns:w14="http://schemas.microsoft.com/office/word/2010/wordml" xmlns:w15="http://schemas.microsoft.com/office/word/2012/wordml" xmlns:w16cex="http://schemas.microsoft.com/office/word/2018/wordml/cex" xmlns:w16cid="http://schemas.microsoft.com/office/word/2016/wordml/cid" xmlns:w16="http://schemas.microsoft.com/office/word/2018/wordml" xmlns:w16du="http://schemas.microsoft.com/office/word/2023/wordml/word16du" xmlns:w16sdtdh="http://schemas.microsoft.com/office/word/2020/wordml/sdtdatahash" xmlns:w16sdtfl="http://schemas.microsoft.com/office/word/2024/wordml/sdtformatlock" xmlns:w16se="http://schemas.microsoft.com/office/word/2015/wordml/symex" xmlns:wpg="http://schemas.microsoft.com/office/word/2010/wordprocessingGroup" xmlns:wpi="http://schemas.microsoft.com/office/word/2010/wordprocessingInk" xmlns:wne="http://schemas.microsoft.com/office/word/2006/wordml" xmlns:wps="http://schemas.microsoft.com/office/word/2010/wordprocessingShape" xmlns:a="http://schemas.openxmlformats.org/drawingml/2006/main" xmlns:pic="http://schemas.openxmlformats.org/drawingml/2006/picture" mc:Ignorable="w14 w15 w16se w16cid w16 w16cex w16sdtdh w16sdtfl w16du wp14">
   <w:body>
     <w:p>
       <w:pPr>
@@ -77,25 +77,40 @@
         <w:pStyle w:val="Ttulo1"/>
       </w:pPr>
       <w:r>
-        <w:t>Resumen ejecutivo</w:t>
-      </w:r>
-    </w:p>
-    <w:p>
-      <w:pPr>
-        <w:numPr>
-          <w:ilvl w:val="0"/>
-          <w:numId w:val="1"/>
-        </w:numPr>
-      </w:pPr>
-      <w:r>
-        <w:t xml:space="preserve">El sistema cumple la arquitectura base del entregable: un supervisor ADK coordina dos subagentes especializados mediante </w:t>
-      </w:r>
-      <w:proofErr w:type="spellStart"/>
-      <w:r>
+        <w:rPr/>
+        <w:t xml:space="preserve">Resumen </w:t>
+      </w:r>
+    </w:p>
+    <w:p>
+      <w:pPr>
+        <w:numPr>
+          <w:ilvl w:val="0"/>
+          <w:numId w:val="1"/>
+        </w:numPr>
+        <w:rPr/>
+      </w:pPr>
+      <w:r>
+        <w:rPr/>
+        <w:t xml:space="preserve">El sistema cumple </w:t>
+      </w:r>
+      <w:r>
+        <w:rPr/>
+        <w:t xml:space="preserve">con la </w:t>
+      </w:r>
+      <w:r>
+        <w:rPr/>
+        <w:t>ba</w:t>
+      </w:r>
+      <w:r>
+        <w:rPr/>
+        <w:t xml:space="preserve">se del entregable: un supervisor ADK coordina dos subagentes especializados mediante </w:t>
+      </w:r>
+      <w:r>
+        <w:rPr/>
         <w:t>AgentTool</w:t>
       </w:r>
-      <w:proofErr w:type="spellEnd"/>
-      <w:r>
+      <w:r>
+        <w:rPr/>
         <w:t>.</w:t>
       </w:r>
     </w:p>
@@ -248,224 +263,246 @@
         <w:pStyle w:val="Ttulo1"/>
       </w:pPr>
       <w:r>
-        <w:lastRenderedPageBreak/>
         <w:t>1. Escenario y objetivo</w:t>
       </w:r>
     </w:p>
     <w:p>
-      <w:proofErr w:type="spellStart"/>
-      <w:r>
+      <w:r>
+        <w:rPr/>
         <w:t>EcomInsight</w:t>
       </w:r>
-      <w:proofErr w:type="spellEnd"/>
-      <w:r>
+      <w:r>
+        <w:rPr/>
         <w:t xml:space="preserve"> </w:t>
       </w:r>
-      <w:proofErr w:type="spellStart"/>
-      <w:r>
+      <w:r>
+        <w:rPr/>
         <w:t>Agent</w:t>
       </w:r>
-      <w:proofErr w:type="spellEnd"/>
-      <w:r>
-        <w:t xml:space="preserve"> esta </w:t>
-      </w:r>
-      <w:r>
+      <w:r>
+        <w:rPr/>
+        <w:t xml:space="preserve"> </w:t>
+      </w:r>
+      <w:r>
+        <w:rPr/>
+        <w:t>está</w:t>
+      </w:r>
+      <w:r>
+        <w:rPr/>
+        <w:t xml:space="preserve"> </w:t>
+      </w:r>
+      <w:r>
+        <w:rPr/>
         <w:t>diseñado</w:t>
       </w:r>
       <w:r>
-        <w:t xml:space="preserve"> para perfiles de negocio, marketing y </w:t>
-      </w:r>
-      <w:r>
+        <w:rPr/>
+        <w:t xml:space="preserve"> para perfiles de </w:t>
+      </w:r>
+      <w:r>
+        <w:rPr/>
+        <w:t>no técnicos que</w:t>
+      </w:r>
+      <w:r>
+        <w:rPr/>
+        <w:t xml:space="preserve"> necesitan consultar datos de e-</w:t>
+      </w:r>
+      <w:r>
+        <w:rPr/>
+        <w:t>commerce</w:t>
+      </w:r>
+      <w:r>
+        <w:rPr/>
+        <w:t xml:space="preserve"> sin escribir SQL. El usuario pregunta en lenguaje natural y el sistema decide si debe obtener </w:t>
+      </w:r>
+      <w:r>
+        <w:rPr/>
+        <w:t>métricas</w:t>
+      </w:r>
+      <w:r>
+        <w:rPr/>
+        <w:t xml:space="preserve">, interpretarlas o persistir los hallazgos como artefactos de </w:t>
+      </w:r>
+      <w:r>
+        <w:rPr/>
+        <w:t>reporting</w:t>
+      </w:r>
+      <w:r>
+        <w:rPr/>
+        <w:t>.</w:t>
+      </w:r>
+    </w:p>
+    <w:p>
+      <w:pPr>
+        <w:pStyle w:val="Ttulo2"/>
+      </w:pPr>
+      <w:r>
+        <w:t>Problema que resuelve</w:t>
+      </w:r>
+    </w:p>
+    <w:p>
+      <w:pPr>
+        <w:numPr>
+          <w:ilvl w:val="0"/>
+          <w:numId w:val="1"/>
+        </w:numPr>
+      </w:pPr>
+      <w:r>
+        <w:t xml:space="preserve">Reduce la dependencia de analistas </w:t>
+      </w:r>
+      <w:r>
+        <w:t>técnicos</w:t>
+      </w:r>
+      <w:r>
+        <w:t xml:space="preserve"> para responder preguntas recurrentes sobre ingresos, pedidos, productos, </w:t>
+      </w:r>
+      <w:r>
+        <w:t>categorías</w:t>
+      </w:r>
+      <w:r>
+        <w:t xml:space="preserve">, </w:t>
+      </w:r>
+      <w:r>
+        <w:t>países</w:t>
+      </w:r>
+      <w:r>
+        <w:t xml:space="preserve"> y clientes.</w:t>
+      </w:r>
+    </w:p>
+    <w:p>
+      <w:pPr>
+        <w:numPr>
+          <w:ilvl w:val="0"/>
+          <w:numId w:val="1"/>
+        </w:numPr>
+      </w:pPr>
+      <w:r>
+        <w:t xml:space="preserve">Convierte datos estructurados de </w:t>
+      </w:r>
+      <w:proofErr w:type="spellStart"/>
+      <w:r>
+        <w:t>BigQuery</w:t>
+      </w:r>
+      <w:proofErr w:type="spellEnd"/>
+      <w:r>
+        <w:t xml:space="preserve"> en conclusiones comerciales legibles y accionables.</w:t>
+      </w:r>
+    </w:p>
+    <w:p>
+      <w:pPr>
+        <w:numPr>
+          <w:ilvl w:val="0"/>
+          <w:numId w:val="1"/>
+        </w:numPr>
+      </w:pPr>
+      <w:r>
+        <w:t>Mantiene una frontera clara de seguridad: el asistente analiza datos, pero no los modifica.</w:t>
+      </w:r>
+    </w:p>
+    <w:p>
+      <w:pPr>
+        <w:numPr>
+          <w:ilvl w:val="0"/>
+          <w:numId w:val="1"/>
+        </w:numPr>
+      </w:pPr>
+      <w:r>
+        <w:t xml:space="preserve">Permite guardar evidencias del razonamiento mediante </w:t>
+      </w:r>
+      <w:proofErr w:type="spellStart"/>
+      <w:r>
+        <w:t>Markdown</w:t>
+      </w:r>
+      <w:proofErr w:type="spellEnd"/>
+      <w:r>
+        <w:t>, JSON y tarjetas KPI generadas por MCP.</w:t>
+      </w:r>
+    </w:p>
+    <w:p>
+      <w:pPr>
+        <w:pStyle w:val="Ttulo2"/>
+      </w:pPr>
+      <w:r>
+        <w:t>Preguntas representativas</w:t>
+      </w:r>
+    </w:p>
+    <w:p>
+      <w:pPr>
+        <w:numPr>
+          <w:ilvl w:val="0"/>
+          <w:numId w:val="1"/>
+        </w:numPr>
+      </w:pPr>
+      <w:r>
+        <w:t>¿Cuáles son las categorías con más ingresos?</w:t>
+      </w:r>
+    </w:p>
+    <w:p>
+      <w:pPr>
+        <w:numPr>
+          <w:ilvl w:val="0"/>
+          <w:numId w:val="1"/>
+        </w:numPr>
+      </w:pPr>
+      <w:r>
+        <w:t>¿Qué países concentran más ventas y donde invertiría marketing?</w:t>
+      </w:r>
+    </w:p>
+    <w:p>
+      <w:pPr>
+        <w:numPr>
+          <w:ilvl w:val="0"/>
+          <w:numId w:val="1"/>
+        </w:numPr>
+      </w:pPr>
+      <w:r>
+        <w:t>¿Cuál es el estado de los pedidos y que porcentaje esta cancelado?</w:t>
+      </w:r>
+    </w:p>
+    <w:p>
+      <w:pPr>
+        <w:numPr>
+          <w:ilvl w:val="0"/>
+          <w:numId w:val="1"/>
+        </w:numPr>
+      </w:pPr>
+      <w:r>
+        <w:t>Genera un informe ejecutivo con los principales hallazgos.</w:t>
+      </w:r>
+    </w:p>
+    <w:p>
+      <w:pPr>
+        <w:numPr>
+          <w:ilvl w:val="0"/>
+          <w:numId w:val="1"/>
+        </w:numPr>
+        <w:rPr/>
+      </w:pPr>
+      <w:r>
+        <w:rPr/>
+        <w:t xml:space="preserve">Guarda un </w:t>
+      </w:r>
+      <w:r>
+        <w:rPr/>
+        <w:t>snapshot</w:t>
+      </w:r>
+      <w:r>
+        <w:rPr/>
+        <w:t xml:space="preserve"> JSON para trazabilidad del </w:t>
+      </w:r>
+      <w:r>
+        <w:rPr/>
         <w:t>análisis</w:t>
       </w:r>
       <w:r>
-        <w:t xml:space="preserve"> comercial que necesitan consultar datos de e-</w:t>
-      </w:r>
-      <w:proofErr w:type="spellStart"/>
-      <w:r>
-        <w:t>commerce</w:t>
-      </w:r>
-      <w:proofErr w:type="spellEnd"/>
-      <w:r>
-        <w:t xml:space="preserve"> sin escribir SQL. El usuario pregunta en lenguaje natural y el sistema decide si debe obtener </w:t>
-      </w:r>
-      <w:r>
-        <w:t>métricas</w:t>
-      </w:r>
-      <w:r>
-        <w:t xml:space="preserve">, interpretarlas o persistir los hallazgos como artefactos de </w:t>
-      </w:r>
-      <w:proofErr w:type="spellStart"/>
-      <w:r>
-        <w:t>reporting</w:t>
-      </w:r>
-      <w:proofErr w:type="spellEnd"/>
-      <w:r>
+        <w:rPr/>
         <w:t>.</w:t>
       </w:r>
     </w:p>
     <w:p>
       <w:pPr>
-        <w:pStyle w:val="Ttulo2"/>
-      </w:pPr>
-      <w:r>
-        <w:t>Problema que resuelve</w:t>
-      </w:r>
-    </w:p>
-    <w:p>
-      <w:pPr>
-        <w:numPr>
-          <w:ilvl w:val="0"/>
-          <w:numId w:val="1"/>
-        </w:numPr>
-      </w:pPr>
-      <w:r>
-        <w:t xml:space="preserve">Reduce la dependencia de analistas </w:t>
-      </w:r>
-      <w:r>
-        <w:t>técnicos</w:t>
-      </w:r>
-      <w:r>
-        <w:t xml:space="preserve"> para responder preguntas recurrentes sobre ingresos, pedidos, productos, </w:t>
-      </w:r>
-      <w:r>
-        <w:t>categorías</w:t>
-      </w:r>
-      <w:r>
-        <w:t xml:space="preserve">, </w:t>
-      </w:r>
-      <w:r>
-        <w:t>países</w:t>
-      </w:r>
-      <w:r>
-        <w:t xml:space="preserve"> y clientes.</w:t>
-      </w:r>
-    </w:p>
-    <w:p>
-      <w:pPr>
-        <w:numPr>
-          <w:ilvl w:val="0"/>
-          <w:numId w:val="1"/>
-        </w:numPr>
-      </w:pPr>
-      <w:r>
-        <w:t xml:space="preserve">Convierte datos estructurados de </w:t>
-      </w:r>
-      <w:proofErr w:type="spellStart"/>
-      <w:r>
-        <w:t>BigQuery</w:t>
-      </w:r>
-      <w:proofErr w:type="spellEnd"/>
-      <w:r>
-        <w:t xml:space="preserve"> en conclusiones comerciales legibles y accionables.</w:t>
-      </w:r>
-    </w:p>
-    <w:p>
-      <w:pPr>
-        <w:numPr>
-          <w:ilvl w:val="0"/>
-          <w:numId w:val="1"/>
-        </w:numPr>
-      </w:pPr>
-      <w:r>
-        <w:t>Mantiene una frontera clara de seguridad: el asistente analiza datos, pero no los modifica.</w:t>
-      </w:r>
-    </w:p>
-    <w:p>
-      <w:pPr>
-        <w:numPr>
-          <w:ilvl w:val="0"/>
-          <w:numId w:val="1"/>
-        </w:numPr>
-      </w:pPr>
-      <w:r>
-        <w:t xml:space="preserve">Permite guardar evidencias del razonamiento mediante </w:t>
-      </w:r>
-      <w:proofErr w:type="spellStart"/>
-      <w:r>
-        <w:t>Markdown</w:t>
-      </w:r>
-      <w:proofErr w:type="spellEnd"/>
-      <w:r>
-        <w:t>, JSON y tarjetas KPI generadas por MCP.</w:t>
-      </w:r>
-    </w:p>
-    <w:p>
-      <w:pPr>
-        <w:pStyle w:val="Ttulo2"/>
-      </w:pPr>
-      <w:r>
-        <w:t>Preguntas representativas</w:t>
-      </w:r>
-    </w:p>
-    <w:p>
-      <w:pPr>
-        <w:numPr>
-          <w:ilvl w:val="0"/>
-          <w:numId w:val="1"/>
-        </w:numPr>
-      </w:pPr>
-      <w:r>
-        <w:t>¿Cuáles son las categorías con más ingresos?</w:t>
-      </w:r>
-    </w:p>
-    <w:p>
-      <w:pPr>
-        <w:numPr>
-          <w:ilvl w:val="0"/>
-          <w:numId w:val="1"/>
-        </w:numPr>
-      </w:pPr>
-      <w:r>
-        <w:t>¿Qué países concentran más ventas y donde invertiría marketing?</w:t>
-      </w:r>
-    </w:p>
-    <w:p>
-      <w:pPr>
-        <w:numPr>
-          <w:ilvl w:val="0"/>
-          <w:numId w:val="1"/>
-        </w:numPr>
-      </w:pPr>
-      <w:r>
-        <w:t>¿Cuál es el estado de los pedidos y que porcentaje esta cancelado?</w:t>
-      </w:r>
-    </w:p>
-    <w:p>
-      <w:pPr>
-        <w:numPr>
-          <w:ilvl w:val="0"/>
-          <w:numId w:val="1"/>
-        </w:numPr>
-      </w:pPr>
-      <w:r>
-        <w:t>Genera un informe ejecutivo con los principales hallazgos.</w:t>
-      </w:r>
-    </w:p>
-    <w:p>
-      <w:pPr>
-        <w:numPr>
-          <w:ilvl w:val="0"/>
-          <w:numId w:val="1"/>
-        </w:numPr>
-      </w:pPr>
-      <w:r>
-        <w:t xml:space="preserve">Guarda un </w:t>
-      </w:r>
-      <w:proofErr w:type="spellStart"/>
-      <w:r>
-        <w:t>snapshot</w:t>
-      </w:r>
-      <w:proofErr w:type="spellEnd"/>
-      <w:r>
-        <w:t xml:space="preserve"> JSON para trazabilidad del </w:t>
-      </w:r>
-      <w:r>
-        <w:t>análisis</w:t>
-      </w:r>
-      <w:r>
-        <w:t>.</w:t>
-      </w:r>
+        <w:ind w:left="720"/>
+      </w:pPr>
     </w:p>
     <w:p>
       <w:pPr>
@@ -477,15 +514,15 @@
     </w:p>
     <w:tbl>
       <w:tblPr>
-        <w:tblW w:w="0" w:type="auto"/>
+        <w:tblW w:w="9980" w:type="dxa"/>
         <w:tblInd w:w="90" w:type="dxa"/>
         <w:tblBorders>
-          <w:top w:val="single" w:sz="4" w:space="0" w:color="D9DEE5"/>
-          <w:left w:val="single" w:sz="4" w:space="0" w:color="D9DEE5"/>
-          <w:bottom w:val="single" w:sz="4" w:space="0" w:color="D9DEE5"/>
-          <w:right w:val="single" w:sz="4" w:space="0" w:color="D9DEE5"/>
-          <w:insideH w:val="single" w:sz="4" w:space="0" w:color="D9DEE5"/>
-          <w:insideV w:val="single" w:sz="4" w:space="0" w:color="D9DEE5"/>
+          <w:top w:val="single" w:color="D9DEE5" w:sz="4" w:space="0"/>
+          <w:left w:val="single" w:color="D9DEE5" w:sz="4" w:space="0"/>
+          <w:bottom w:val="single" w:color="D9DEE5" w:sz="4" w:space="0"/>
+          <w:right w:val="single" w:color="D9DEE5" w:sz="4" w:space="0"/>
+          <w:insideH w:val="single" w:color="D9DEE5" w:sz="4" w:space="0"/>
+          <w:insideV w:val="single" w:color="D9DEE5" w:sz="4" w:space="0"/>
         </w:tblBorders>
         <w:tblCellMar>
           <w:top w:w="90" w:type="dxa"/>
@@ -498,13 +535,14 @@
       <w:tblGrid>
         <w:gridCol w:w="1808"/>
         <w:gridCol w:w="4152"/>
-        <w:gridCol w:w="3768"/>
+        <w:gridCol w:w="4020"/>
       </w:tblGrid>
       <w:tr>
         <w:tc>
           <w:tcPr>
-            <w:tcW w:w="1900" w:type="dxa"/>
+            <w:tcW w:w="1808" w:type="dxa"/>
             <w:shd w:val="clear" w:color="auto" w:fill="123447"/>
+            <w:tcMar/>
           </w:tcPr>
           <w:p>
             <w:r>
@@ -517,8 +555,9 @@
         </w:tc>
         <w:tc>
           <w:tcPr>
-            <w:tcW w:w="4700" w:type="dxa"/>
+            <w:tcW w:w="4152" w:type="dxa"/>
             <w:shd w:val="clear" w:color="auto" w:fill="123447"/>
+            <w:tcMar/>
           </w:tcPr>
           <w:p>
             <w:r>
@@ -537,8 +576,9 @@
         </w:tc>
         <w:tc>
           <w:tcPr>
-            <w:tcW w:w="2400" w:type="dxa"/>
+            <w:tcW w:w="4020" w:type="dxa"/>
             <w:shd w:val="clear" w:color="auto" w:fill="123447"/>
+            <w:tcMar/>
           </w:tcPr>
           <w:p>
             <w:r>
@@ -553,7 +593,8 @@
       <w:tr>
         <w:tc>
           <w:tcPr>
-            <w:tcW w:w="1900" w:type="dxa"/>
+            <w:tcW w:w="1808" w:type="dxa"/>
+            <w:tcMar/>
           </w:tcPr>
           <w:p>
             <w:r>
@@ -563,7 +604,8 @@
         </w:tc>
         <w:tc>
           <w:tcPr>
-            <w:tcW w:w="4700" w:type="dxa"/>
+            <w:tcW w:w="4152" w:type="dxa"/>
+            <w:tcMar/>
           </w:tcPr>
           <w:p>
             <w:proofErr w:type="spellStart"/>
@@ -584,7 +626,8 @@
         </w:tc>
         <w:tc>
           <w:tcPr>
-            <w:tcW w:w="2400" w:type="dxa"/>
+            <w:tcW w:w="4020" w:type="dxa"/>
+            <w:tcMar/>
           </w:tcPr>
           <w:p>
             <w:r>
@@ -596,7 +639,8 @@
       <w:tr>
         <w:tc>
           <w:tcPr>
-            <w:tcW w:w="1900" w:type="dxa"/>
+            <w:tcW w:w="1808" w:type="dxa"/>
+            <w:tcMar/>
           </w:tcPr>
           <w:p>
             <w:r>
@@ -606,7 +650,8 @@
         </w:tc>
         <w:tc>
           <w:tcPr>
-            <w:tcW w:w="4700" w:type="dxa"/>
+            <w:tcW w:w="4152" w:type="dxa"/>
+            <w:tcMar/>
           </w:tcPr>
           <w:p>
             <w:proofErr w:type="spellStart"/>
@@ -645,7 +690,8 @@
         </w:tc>
         <w:tc>
           <w:tcPr>
-            <w:tcW w:w="2400" w:type="dxa"/>
+            <w:tcW w:w="4020" w:type="dxa"/>
+            <w:tcMar/>
           </w:tcPr>
           <w:p>
             <w:proofErr w:type="spellStart"/>
@@ -670,7 +716,8 @@
       <w:tr>
         <w:tc>
           <w:tcPr>
-            <w:tcW w:w="1900" w:type="dxa"/>
+            <w:tcW w:w="1808" w:type="dxa"/>
+            <w:tcMar/>
           </w:tcPr>
           <w:p>
             <w:r>
@@ -680,7 +727,8 @@
         </w:tc>
         <w:tc>
           <w:tcPr>
-            <w:tcW w:w="4700" w:type="dxa"/>
+            <w:tcW w:w="4152" w:type="dxa"/>
+            <w:tcMar/>
           </w:tcPr>
           <w:p>
             <w:r>
@@ -706,7 +754,8 @@
         </w:tc>
         <w:tc>
           <w:tcPr>
-            <w:tcW w:w="2400" w:type="dxa"/>
+            <w:tcW w:w="4020" w:type="dxa"/>
+            <w:tcMar/>
           </w:tcPr>
           <w:p>
             <w:r>
@@ -718,7 +767,8 @@
       <w:tr>
         <w:tc>
           <w:tcPr>
-            <w:tcW w:w="1900" w:type="dxa"/>
+            <w:tcW w:w="1808" w:type="dxa"/>
+            <w:tcMar/>
           </w:tcPr>
           <w:p>
             <w:r>
@@ -728,7 +778,8 @@
         </w:tc>
         <w:tc>
           <w:tcPr>
-            <w:tcW w:w="4700" w:type="dxa"/>
+            <w:tcW w:w="4152" w:type="dxa"/>
+            <w:tcMar/>
           </w:tcPr>
           <w:p>
             <w:proofErr w:type="spellStart"/>
@@ -751,7 +802,8 @@
         </w:tc>
         <w:tc>
           <w:tcPr>
-            <w:tcW w:w="2400" w:type="dxa"/>
+            <w:tcW w:w="4020" w:type="dxa"/>
+            <w:tcMar/>
           </w:tcPr>
           <w:p>
             <w:r>
@@ -763,7 +815,8 @@
       <w:tr>
         <w:tc>
           <w:tcPr>
-            <w:tcW w:w="1900" w:type="dxa"/>
+            <w:tcW w:w="1808" w:type="dxa"/>
+            <w:tcMar/>
           </w:tcPr>
           <w:p>
             <w:proofErr w:type="spellStart"/>
@@ -778,7 +831,8 @@
         </w:tc>
         <w:tc>
           <w:tcPr>
-            <w:tcW w:w="4700" w:type="dxa"/>
+            <w:tcW w:w="4152" w:type="dxa"/>
+            <w:tcMar/>
           </w:tcPr>
           <w:p>
             <w:proofErr w:type="spellStart"/>
@@ -817,7 +871,8 @@
         </w:tc>
         <w:tc>
           <w:tcPr>
-            <w:tcW w:w="2400" w:type="dxa"/>
+            <w:tcW w:w="4020" w:type="dxa"/>
+            <w:tcMar/>
           </w:tcPr>
           <w:p>
             <w:proofErr w:type="spellStart"/>
@@ -842,7 +897,6 @@
         <w:pStyle w:val="Ttulo1"/>
       </w:pPr>
       <w:r>
-        <w:lastRenderedPageBreak/>
         <w:t>2. Arquitectura</w:t>
       </w:r>
     </w:p>
@@ -922,13 +976,22 @@
     <w:p>
       <w:r>
         <w:rPr>
-          <w:i/>
+          <w:i w:val="1"/>
+          <w:iCs w:val="1"/>
         </w:rPr>
         <w:t>Figura 1. Diagrama de arquitectura incluido en el repositorio.</w:t>
       </w:r>
     </w:p>
     <w:p>
       <w:pPr>
+        <w:rPr>
+          <w:i w:val="1"/>
+          <w:iCs w:val="1"/>
+        </w:rPr>
+      </w:pPr>
+    </w:p>
+    <w:p>
+      <w:pPr>
         <w:pStyle w:val="Ttulo2"/>
       </w:pPr>
       <w:r>
@@ -1101,7 +1164,6 @@
         <w:pStyle w:val="Ttulo1"/>
       </w:pPr>
       <w:r>
-        <w:lastRenderedPageBreak/>
         <w:t>3. Desglose de componentes</w:t>
       </w:r>
     </w:p>
@@ -1531,7 +1593,6 @@
         <w:pStyle w:val="Ttulo1"/>
       </w:pPr>
       <w:r>
-        <w:lastRenderedPageBreak/>
         <w:t xml:space="preserve">4. Servidor MCP de </w:t>
       </w:r>
       <w:proofErr w:type="spellStart"/>
@@ -1574,12 +1635,12 @@
         <w:tblW w:w="0" w:type="auto"/>
         <w:tblInd w:w="90" w:type="dxa"/>
         <w:tblBorders>
-          <w:top w:val="single" w:sz="4" w:space="0" w:color="D9DEE5"/>
-          <w:left w:val="single" w:sz="4" w:space="0" w:color="D9DEE5"/>
-          <w:bottom w:val="single" w:sz="4" w:space="0" w:color="D9DEE5"/>
-          <w:right w:val="single" w:sz="4" w:space="0" w:color="D9DEE5"/>
-          <w:insideH w:val="single" w:sz="4" w:space="0" w:color="D9DEE5"/>
-          <w:insideV w:val="single" w:sz="4" w:space="0" w:color="D9DEE5"/>
+          <w:top w:val="single" w:color="D9DEE5" w:sz="4" w:space="0"/>
+          <w:left w:val="single" w:color="D9DEE5" w:sz="4" w:space="0"/>
+          <w:bottom w:val="single" w:color="D9DEE5" w:sz="4" w:space="0"/>
+          <w:right w:val="single" w:color="D9DEE5" w:sz="4" w:space="0"/>
+          <w:insideH w:val="single" w:color="D9DEE5" w:sz="4" w:space="0"/>
+          <w:insideV w:val="single" w:color="D9DEE5" w:sz="4" w:space="0"/>
         </w:tblBorders>
         <w:tblCellMar>
           <w:top w:w="90" w:type="dxa"/>
@@ -1910,7 +1971,6 @@
         <w:pStyle w:val="Ttulo1"/>
       </w:pPr>
       <w:r>
-        <w:lastRenderedPageBreak/>
         <w:t>5. Fuente de datos y seguridad SQL</w:t>
       </w:r>
     </w:p>
@@ -2582,7 +2642,6 @@
         <w:pStyle w:val="Ttulo1"/>
       </w:pPr>
       <w:r>
-        <w:lastRenderedPageBreak/>
         <w:t>6</w:t>
       </w:r>
       <w:r>
@@ -2611,12 +2670,12 @@
         <w:tblW w:w="0" w:type="auto"/>
         <w:tblInd w:w="90" w:type="dxa"/>
         <w:tblBorders>
-          <w:top w:val="single" w:sz="4" w:space="0" w:color="D9DEE5"/>
-          <w:left w:val="single" w:sz="4" w:space="0" w:color="D9DEE5"/>
-          <w:bottom w:val="single" w:sz="4" w:space="0" w:color="D9DEE5"/>
-          <w:right w:val="single" w:sz="4" w:space="0" w:color="D9DEE5"/>
-          <w:insideH w:val="single" w:sz="4" w:space="0" w:color="D9DEE5"/>
-          <w:insideV w:val="single" w:sz="4" w:space="0" w:color="D9DEE5"/>
+          <w:top w:val="single" w:color="D9DEE5" w:sz="4" w:space="0"/>
+          <w:left w:val="single" w:color="D9DEE5" w:sz="4" w:space="0"/>
+          <w:bottom w:val="single" w:color="D9DEE5" w:sz="4" w:space="0"/>
+          <w:right w:val="single" w:color="D9DEE5" w:sz="4" w:space="0"/>
+          <w:insideH w:val="single" w:color="D9DEE5" w:sz="4" w:space="0"/>
+          <w:insideV w:val="single" w:color="D9DEE5" w:sz="4" w:space="0"/>
         </w:tblBorders>
         <w:tblCellMar>
           <w:top w:w="90" w:type="dxa"/>
@@ -2989,17 +3048,25 @@
           <w:ilvl w:val="0"/>
           <w:numId w:val="1"/>
         </w:numPr>
-      </w:pPr>
-      <w:r>
+        <w:rPr/>
+      </w:pPr>
+      <w:r>
+        <w:rPr>
+          <w:lang w:val="en-US"/>
+        </w:rPr>
         <w:t xml:space="preserve">El script e2e usa la URL https://ecominsight-agent-service-2axrir7upq-uc.a.run.app/sse para validar </w:t>
       </w:r>
-      <w:proofErr w:type="spellStart"/>
-      <w:r>
-        <w:t>handshake</w:t>
-      </w:r>
-      <w:proofErr w:type="spellEnd"/>
-      <w:r>
-        <w:t xml:space="preserve"> MCP por SSE.</w:t>
+      <w:r>
+        <w:rPr>
+          <w:lang w:val="en-US"/>
+        </w:rPr>
+        <w:t xml:space="preserve">el inicio del subagente </w:t>
+      </w:r>
+      <w:r>
+        <w:rPr>
+          <w:lang w:val="en-US"/>
+        </w:rPr>
+        <w:t>MCP por SSE.</w:t>
       </w:r>
     </w:p>
     <w:p>
@@ -3012,7 +3079,6 @@
         <w:pStyle w:val="Ttulo1"/>
       </w:pPr>
       <w:r>
-        <w:lastRenderedPageBreak/>
         <w:t>7</w:t>
       </w:r>
       <w:r>
@@ -3021,15 +3087,15 @@
     </w:p>
     <w:tbl>
       <w:tblPr>
-        <w:tblW w:w="0" w:type="auto"/>
+        <w:tblW w:w="9278" w:type="dxa"/>
         <w:tblInd w:w="90" w:type="dxa"/>
         <w:tblBorders>
-          <w:top w:val="single" w:sz="4" w:space="0" w:color="D9DEE5"/>
-          <w:left w:val="single" w:sz="4" w:space="0" w:color="D9DEE5"/>
-          <w:bottom w:val="single" w:sz="4" w:space="0" w:color="D9DEE5"/>
-          <w:right w:val="single" w:sz="4" w:space="0" w:color="D9DEE5"/>
-          <w:insideH w:val="single" w:sz="4" w:space="0" w:color="D9DEE5"/>
-          <w:insideV w:val="single" w:sz="4" w:space="0" w:color="D9DEE5"/>
+          <w:top w:val="single" w:color="D9DEE5" w:sz="4" w:space="0"/>
+          <w:left w:val="single" w:color="D9DEE5" w:sz="4" w:space="0"/>
+          <w:bottom w:val="single" w:color="D9DEE5" w:sz="4" w:space="0"/>
+          <w:right w:val="single" w:color="D9DEE5" w:sz="4" w:space="0"/>
+          <w:insideH w:val="single" w:color="D9DEE5" w:sz="4" w:space="0"/>
+          <w:insideV w:val="single" w:color="D9DEE5" w:sz="4" w:space="0"/>
         </w:tblBorders>
         <w:tblCellMar>
           <w:top w:w="90" w:type="dxa"/>
@@ -3041,14 +3107,15 @@
       </w:tblPr>
       <w:tblGrid>
         <w:gridCol w:w="2300"/>
-        <w:gridCol w:w="3578"/>
-        <w:gridCol w:w="3400"/>
+        <w:gridCol w:w="3705"/>
+        <w:gridCol w:w="3273"/>
       </w:tblGrid>
       <w:tr>
         <w:tc>
           <w:tcPr>
             <w:tcW w:w="2300" w:type="dxa"/>
             <w:shd w:val="clear" w:color="auto" w:fill="123447"/>
+            <w:tcMar/>
           </w:tcPr>
           <w:p>
             <w:proofErr w:type="spellStart"/>
@@ -3063,8 +3130,9 @@
         </w:tc>
         <w:tc>
           <w:tcPr>
-            <w:tcW w:w="3300" w:type="dxa"/>
+            <w:tcW w:w="3705" w:type="dxa"/>
             <w:shd w:val="clear" w:color="auto" w:fill="123447"/>
+            <w:tcMar/>
           </w:tcPr>
           <w:p>
             <w:r>
@@ -3077,8 +3145,9 @@
         </w:tc>
         <w:tc>
           <w:tcPr>
-            <w:tcW w:w="3400" w:type="dxa"/>
+            <w:tcW w:w="3273" w:type="dxa"/>
             <w:shd w:val="clear" w:color="auto" w:fill="123447"/>
+            <w:tcMar/>
           </w:tcPr>
           <w:p>
             <w:r>
@@ -3094,6 +3163,7 @@
         <w:tc>
           <w:tcPr>
             <w:tcW w:w="2300" w:type="dxa"/>
+            <w:tcMar/>
           </w:tcPr>
           <w:p>
             <w:r>
@@ -3103,7 +3173,8 @@
         </w:tc>
         <w:tc>
           <w:tcPr>
-            <w:tcW w:w="3300" w:type="dxa"/>
+            <w:tcW w:w="3705" w:type="dxa"/>
+            <w:tcMar/>
           </w:tcPr>
           <w:p>
             <w:r>
@@ -3113,7 +3184,8 @@
         </w:tc>
         <w:tc>
           <w:tcPr>
-            <w:tcW w:w="3400" w:type="dxa"/>
+            <w:tcW w:w="3273" w:type="dxa"/>
+            <w:tcMar/>
           </w:tcPr>
           <w:p>
             <w:r>
@@ -3148,6 +3220,7 @@
         <w:tc>
           <w:tcPr>
             <w:tcW w:w="2300" w:type="dxa"/>
+            <w:tcMar/>
           </w:tcPr>
           <w:p>
             <w:r>
@@ -3162,7 +3235,8 @@
         </w:tc>
         <w:tc>
           <w:tcPr>
-            <w:tcW w:w="3300" w:type="dxa"/>
+            <w:tcW w:w="3705" w:type="dxa"/>
+            <w:tcMar/>
           </w:tcPr>
           <w:p>
             <w:r>
@@ -3172,7 +3246,8 @@
         </w:tc>
         <w:tc>
           <w:tcPr>
-            <w:tcW w:w="3400" w:type="dxa"/>
+            <w:tcW w:w="3273" w:type="dxa"/>
+            <w:tcMar/>
           </w:tcPr>
           <w:p>
             <w:r>
@@ -3209,6 +3284,7 @@
         <w:tc>
           <w:tcPr>
             <w:tcW w:w="2300" w:type="dxa"/>
+            <w:tcMar/>
           </w:tcPr>
           <w:p>
             <w:r>
@@ -3218,7 +3294,8 @@
         </w:tc>
         <w:tc>
           <w:tcPr>
-            <w:tcW w:w="3300" w:type="dxa"/>
+            <w:tcW w:w="3705" w:type="dxa"/>
+            <w:tcMar/>
           </w:tcPr>
           <w:p>
             <w:proofErr w:type="spellStart"/>
@@ -3249,7 +3326,8 @@
         </w:tc>
         <w:tc>
           <w:tcPr>
-            <w:tcW w:w="3400" w:type="dxa"/>
+            <w:tcW w:w="3273" w:type="dxa"/>
+            <w:tcMar/>
           </w:tcPr>
           <w:p>
             <w:r>
@@ -3268,6 +3346,7 @@
         <w:tc>
           <w:tcPr>
             <w:tcW w:w="2300" w:type="dxa"/>
+            <w:tcMar/>
           </w:tcPr>
           <w:p>
             <w:r>
@@ -3277,7 +3356,8 @@
         </w:tc>
         <w:tc>
           <w:tcPr>
-            <w:tcW w:w="3300" w:type="dxa"/>
+            <w:tcW w:w="3705" w:type="dxa"/>
+            <w:tcMar/>
           </w:tcPr>
           <w:p>
             <w:r>
@@ -3293,7 +3373,8 @@
         </w:tc>
         <w:tc>
           <w:tcPr>
-            <w:tcW w:w="3400" w:type="dxa"/>
+            <w:tcW w:w="3273" w:type="dxa"/>
+            <w:tcMar/>
           </w:tcPr>
           <w:p>
             <w:r>
@@ -3320,6 +3401,7 @@
         <w:tc>
           <w:tcPr>
             <w:tcW w:w="2300" w:type="dxa"/>
+            <w:tcMar/>
           </w:tcPr>
           <w:p>
             <w:proofErr w:type="spellStart"/>
@@ -3339,7 +3421,8 @@
         </w:tc>
         <w:tc>
           <w:tcPr>
-            <w:tcW w:w="3300" w:type="dxa"/>
+            <w:tcW w:w="3705" w:type="dxa"/>
+            <w:tcMar/>
           </w:tcPr>
           <w:p>
             <w:r>
@@ -3355,7 +3438,8 @@
         </w:tc>
         <w:tc>
           <w:tcPr>
-            <w:tcW w:w="3400" w:type="dxa"/>
+            <w:tcW w:w="3273" w:type="dxa"/>
+            <w:tcMar/>
           </w:tcPr>
           <w:p>
             <w:r>
@@ -3380,6 +3464,7 @@
         <w:tc>
           <w:tcPr>
             <w:tcW w:w="2300" w:type="dxa"/>
+            <w:tcMar/>
           </w:tcPr>
           <w:p>
             <w:r>
@@ -3389,7 +3474,8 @@
         </w:tc>
         <w:tc>
           <w:tcPr>
-            <w:tcW w:w="3300" w:type="dxa"/>
+            <w:tcW w:w="3705" w:type="dxa"/>
+            <w:tcMar/>
           </w:tcPr>
           <w:p>
             <w:r>
@@ -3399,7 +3485,8 @@
         </w:tc>
         <w:tc>
           <w:tcPr>
-            <w:tcW w:w="3400" w:type="dxa"/>
+            <w:tcW w:w="3273" w:type="dxa"/>
+            <w:tcMar/>
           </w:tcPr>
           <w:p>
             <w:r>
@@ -3512,36 +3599,42 @@
           <w:ilvl w:val="0"/>
           <w:numId w:val="1"/>
         </w:numPr>
-      </w:pPr>
-      <w:r>
+        <w:rPr/>
+      </w:pPr>
+      <w:r>
+        <w:rPr/>
         <w:t xml:space="preserve">Extender la fuente fundamentada con RAG documental para combinar </w:t>
       </w:r>
       <w:r>
+        <w:rPr/>
         <w:t>políticas</w:t>
       </w:r>
       <w:r>
+        <w:rPr/>
         <w:t xml:space="preserve"> internas, </w:t>
       </w:r>
-      <w:proofErr w:type="spellStart"/>
-      <w:r>
+      <w:r>
+        <w:rPr/>
         <w:t>runbooks</w:t>
       </w:r>
-      <w:proofErr w:type="spellEnd"/>
-      <w:r>
+      <w:r>
+        <w:rPr/>
         <w:t xml:space="preserve"> o informes </w:t>
       </w:r>
       <w:r>
+        <w:rPr/>
         <w:t>históricos</w:t>
       </w:r>
       <w:r>
+        <w:rPr/>
         <w:t xml:space="preserve"> con </w:t>
       </w:r>
-      <w:proofErr w:type="spellStart"/>
-      <w:r>
+      <w:r>
+        <w:rPr/>
         <w:t>BigQuery</w:t>
       </w:r>
-      <w:proofErr w:type="spellEnd"/>
-      <w:r>
+      <w:r>
+        <w:rPr/>
         <w:t>.</w:t>
       </w:r>
     </w:p>
@@ -3551,36 +3644,129 @@
           <w:ilvl w:val="0"/>
           <w:numId w:val="1"/>
         </w:numPr>
-      </w:pPr>
-      <w:r>
+        <w:rPr/>
+      </w:pPr>
+      <w:r>
+        <w:rPr/>
+        <w:t xml:space="preserve">Extender las funcionalidades a uso de buscador externo para enriquecer contexto y valorar oportunidades y </w:t>
+      </w:r>
+      <w:r>
+        <w:rPr/>
+        <w:t>amenzas</w:t>
+      </w:r>
+      <w:r>
+        <w:rPr/>
+        <w:t>.</w:t>
+      </w:r>
+    </w:p>
+    <w:p>
+      <w:pPr>
+        <w:numPr>
+          <w:ilvl w:val="0"/>
+          <w:numId w:val="1"/>
+        </w:numPr>
+        <w:rPr/>
+      </w:pPr>
+      <w:r>
+        <w:rPr/>
+        <w:t xml:space="preserve">Añadir lógica de </w:t>
+      </w:r>
+      <w:r>
+        <w:rPr/>
+        <w:t>reranking</w:t>
+      </w:r>
+      <w:r>
+        <w:rPr/>
+        <w:t xml:space="preserve"> en la parte de </w:t>
+      </w:r>
+      <w:r>
+        <w:rPr/>
+        <w:t>retrieval</w:t>
+      </w:r>
+      <w:r>
+        <w:rPr/>
+        <w:t xml:space="preserve"> para el subagente SQL.</w:t>
+      </w:r>
+    </w:p>
+    <w:p>
+      <w:pPr>
+        <w:numPr>
+          <w:ilvl w:val="0"/>
+          <w:numId w:val="1"/>
+        </w:numPr>
+        <w:rPr/>
+      </w:pPr>
+      <w:r>
+        <w:rPr/>
         <w:t xml:space="preserve">Incorporar </w:t>
       </w:r>
-      <w:proofErr w:type="spellStart"/>
-      <w:r>
+      <w:r>
+        <w:rPr/>
         <w:t>logging</w:t>
       </w:r>
-      <w:proofErr w:type="spellEnd"/>
-      <w:r>
+      <w:r>
+        <w:rPr/>
         <w:t xml:space="preserve"> estructurado por </w:t>
       </w:r>
-      <w:proofErr w:type="spellStart"/>
-      <w:r>
+      <w:r>
+        <w:rPr/>
         <w:t>tool</w:t>
       </w:r>
-      <w:proofErr w:type="spellEnd"/>
-      <w:r>
+      <w:r>
+        <w:rPr/>
         <w:t xml:space="preserve"> </w:t>
       </w:r>
-      <w:proofErr w:type="spellStart"/>
-      <w:r>
+      <w:r>
+        <w:rPr/>
         <w:t>call</w:t>
       </w:r>
-      <w:proofErr w:type="spellEnd"/>
-      <w:r>
+      <w:r>
+        <w:rPr/>
         <w:t>, SQL, bytes estimados y tiempo de respuesta.</w:t>
       </w:r>
     </w:p>
     <w:p>
+      <w:pPr>
+        <w:numPr>
+          <w:ilvl w:val="0"/>
+          <w:numId w:val="1"/>
+        </w:numPr>
+        <w:rPr/>
+      </w:pPr>
+      <w:r>
+        <w:rPr/>
+        <w:t xml:space="preserve">Añadir un nodo </w:t>
+      </w:r>
+      <w:r>
+        <w:rPr/>
+        <w:t>supervirsor</w:t>
+      </w:r>
+      <w:r>
+        <w:rPr/>
+        <w:t xml:space="preserve"> con lógica de </w:t>
+      </w:r>
+      <w:r>
+        <w:rPr/>
+        <w:t>max</w:t>
+      </w:r>
+      <w:r>
+        <w:rPr/>
+        <w:t xml:space="preserve"> </w:t>
+      </w:r>
+      <w:r>
+        <w:rPr/>
+        <w:t>retries</w:t>
+      </w:r>
+      <w:r>
+        <w:rPr/>
+        <w:t xml:space="preserve"> para refinar el output generado por el </w:t>
+      </w:r>
+      <w:r>
+        <w:rPr/>
+        <w:t>subagente MCP</w:t>
+      </w:r>
+    </w:p>
+    <w:p>
       <w:r>
         <w:br w:type="page"/>
       </w:r>
@@ -3590,7 +3776,6 @@
         <w:pStyle w:val="Ttulo1"/>
       </w:pPr>
       <w:r>
-        <w:lastRenderedPageBreak/>
         <w:t>8</w:t>
       </w:r>
       <w:r>
@@ -3944,105 +4129,53 @@
           <w:ilvl w:val="0"/>
           <w:numId w:val="1"/>
         </w:numPr>
-      </w:pPr>
-      <w:r>
-        <w:t xml:space="preserve">ECOMINSIGHT_MCP_HOST, ECOMINSIGHT_MCP_PORT y PORT permiten </w:t>
-      </w:r>
-      <w:r>
+        <w:rPr/>
+      </w:pPr>
+      <w:r>
+        <w:rPr>
+          <w:lang w:val="en-US"/>
+        </w:rPr>
+        <w:t>ECOMINSIGHT_</w:t>
+      </w:r>
+      <w:r>
+        <w:rPr>
+          <w:lang w:val="en-US"/>
+        </w:rPr>
+        <w:t>MCP</w:t>
+      </w:r>
+      <w:r>
+        <w:rPr>
+          <w:lang w:val="en-US"/>
+        </w:rPr>
+        <w:t>_HOST, ECOMINSIGHT_</w:t>
+      </w:r>
+      <w:r>
+        <w:rPr>
+          <w:lang w:val="en-US"/>
+        </w:rPr>
+        <w:t>MCP</w:t>
+      </w:r>
+      <w:r>
+        <w:rPr>
+          <w:lang w:val="en-US"/>
+        </w:rPr>
+        <w:t xml:space="preserve">_PORT y PORT permiten </w:t>
+      </w:r>
+      <w:r>
+        <w:rPr>
+          <w:lang w:val="en-US"/>
+        </w:rPr>
         <w:t>ejecución</w:t>
       </w:r>
       <w:r>
+        <w:rPr>
+          <w:lang w:val="en-US"/>
+        </w:rPr>
         <w:t xml:space="preserve"> local y Cloud Run.</w:t>
       </w:r>
     </w:p>
-    <w:tbl>
-      <w:tblPr>
-        <w:tblW w:w="0" w:type="auto"/>
-        <w:tblInd w:w="90" w:type="dxa"/>
-        <w:tblBorders>
-          <w:top w:val="single" w:sz="4" w:space="0" w:color="D9DEE5"/>
-          <w:left w:val="single" w:sz="4" w:space="0" w:color="D9DEE5"/>
-          <w:bottom w:val="single" w:sz="4" w:space="0" w:color="D9DEE5"/>
-          <w:right w:val="single" w:sz="4" w:space="0" w:color="D9DEE5"/>
-          <w:insideH w:val="single" w:sz="4" w:space="0" w:color="D9DEE5"/>
-          <w:insideV w:val="single" w:sz="4" w:space="0" w:color="D9DEE5"/>
-        </w:tblBorders>
-        <w:tblCellMar>
-          <w:top w:w="90" w:type="dxa"/>
-          <w:left w:w="90" w:type="dxa"/>
-          <w:bottom w:w="90" w:type="dxa"/>
-          <w:right w:w="90" w:type="dxa"/>
-        </w:tblCellMar>
-        <w:tblLook w:val="0000" w:firstRow="0" w:lastRow="0" w:firstColumn="0" w:lastColumn="0" w:noHBand="0" w:noVBand="0"/>
-      </w:tblPr>
-      <w:tblGrid>
-        <w:gridCol w:w="200"/>
-        <w:gridCol w:w="9528"/>
-      </w:tblGrid>
-      <w:tr>
-        <w:tc>
-          <w:tcPr>
-            <w:tcW w:w="200" w:type="dxa"/>
-            <w:shd w:val="clear" w:color="auto" w:fill="EAF7EA"/>
-          </w:tcPr>
-          <w:p/>
-        </w:tc>
-        <w:tc>
-          <w:tcPr>
-            <w:tcW w:w="9528" w:type="dxa"/>
-            <w:shd w:val="clear" w:color="auto" w:fill="EAF7EA"/>
-          </w:tcPr>
-          <w:p>
-            <w:r>
-              <w:rPr>
-                <w:b/>
-              </w:rPr>
-              <w:t>Cierre</w:t>
-            </w:r>
-          </w:p>
-          <w:p>
-            <w:r>
-              <w:t xml:space="preserve">El entregable documenta un sistema multiagente funcional con </w:t>
-            </w:r>
-            <w:proofErr w:type="spellStart"/>
-            <w:r>
-              <w:t>grounding</w:t>
-            </w:r>
-            <w:proofErr w:type="spellEnd"/>
-            <w:r>
-              <w:t xml:space="preserve"> estructurado, herramientas MCP propias, controles de seguridad y pruebas unitarias. La principal </w:t>
-            </w:r>
-            <w:r>
-              <w:t>acción</w:t>
-            </w:r>
-            <w:r>
-              <w:t xml:space="preserve"> pendiente antes del </w:t>
-            </w:r>
-            <w:r>
-              <w:t>envió</w:t>
-            </w:r>
-            <w:r>
-              <w:t xml:space="preserve"> </w:t>
-            </w:r>
-            <w:r>
-              <w:t>académico</w:t>
-            </w:r>
-            <w:r>
-              <w:t xml:space="preserve"> es adjuntar capturas reales de ADK Web si el docente las exige como </w:t>
-            </w:r>
-            <w:r>
-              <w:t>imágenes</w:t>
-            </w:r>
-            <w:r>
-              <w:t xml:space="preserve"> de pantalla.</w:t>
-            </w:r>
-          </w:p>
-        </w:tc>
-      </w:tr>
-    </w:tbl>
-    <w:p/>
     <w:sectPr>
-      <w:pgSz w:w="11906" w:h="16838"/>
+      <w:pgSz w:w="11906" w:h="16838" w:orient="portrait"/>
       <w:pgMar w:top="1134" w:right="1134" w:bottom="1134" w:left="1134" w:header="720" w:footer="720" w:gutter="0"/>
       <w:cols w:space="720"/>
     </w:sectPr>
@@ -4113,11 +4246,11 @@
 </file>
 
 <file path=word/styles.xml><?xml version="1.0" encoding="utf-8"?>
-<w:styles xmlns:mc="http://schemas.openxmlformats.org/markup-compatibility/2006" xmlns:r="http://schemas.openxmlformats.org/officeDocument/2006/relationships" xmlns:w="http://schemas.openxmlformats.org/wordprocessingml/2006/main" xmlns:w14="http://schemas.microsoft.com/office/word/2010/wordml" xmlns:w15="http://schemas.microsoft.com/office/word/2012/wordml" xmlns:w16cex="http://schemas.microsoft.com/office/word/2018/wordml/cex" xmlns:w16cid="http://schemas.microsoft.com/office/word/2016/wordml/cid" xmlns:w16="http://schemas.microsoft.com/office/word/2018/wordml" xmlns:w16du="http://schemas.microsoft.com/office/word/2023/wordml/word16du" xmlns:w16sdtdh="http://schemas.microsoft.com/office/word/2020/wordml/sdtdatahash" xmlns:w16sdtfl="http://schemas.microsoft.com/office/word/2024/wordml/sdtformatlock" xmlns:w16se="http://schemas.microsoft.com/office/word/2015/wordml/symex" mc:Ignorable="w14 w15 w16se w16cid w16 w16cex w16sdtdh w16sdtfl w16du">
+<w:styles xmlns:wp14="http://schemas.microsoft.com/office/word/2010/wordprocessingDrawing" xmlns:mc="http://schemas.openxmlformats.org/markup-compatibility/2006" xmlns:r="http://schemas.openxmlformats.org/officeDocument/2006/relationships" xmlns:w="http://schemas.openxmlformats.org/wordprocessingml/2006/main" xmlns:w14="http://schemas.microsoft.com/office/word/2010/wordml" xmlns:w15="http://schemas.microsoft.com/office/word/2012/wordml" xmlns:w16cex="http://schemas.microsoft.com/office/word/2018/wordml/cex" xmlns:w16cid="http://schemas.microsoft.com/office/word/2016/wordml/cid" xmlns:w16="http://schemas.microsoft.com/office/word/2018/wordml" xmlns:w16du="http://schemas.microsoft.com/office/word/2023/wordml/word16du" xmlns:w16sdtdh="http://schemas.microsoft.com/office/word/2020/wordml/sdtdatahash" xmlns:w16sdtfl="http://schemas.microsoft.com/office/word/2024/wordml/sdtformatlock" xmlns:w16se="http://schemas.microsoft.com/office/word/2015/wordml/symex" mc:Ignorable="w14 w15 w16se w16cid w16 w16cex w16sdtdh w16sdtfl w16du wp14">
   <w:docDefaults>
     <w:rPrDefault>
       <w:rPr>
-        <w:rFonts w:ascii="Calibri" w:eastAsia="Times New Roman" w:hAnsi="Calibri" w:cs="Times New Roman"/>
+        <w:rFonts w:ascii="Calibri" w:hAnsi="Calibri" w:eastAsia="Times New Roman" w:cs="Times New Roman"/>
         <w:sz w:val="22"/>
         <w:lang w:val="es-ES" w:eastAsia="es-ES_tradnl" w:bidi="ar-SA"/>
       </w:rPr>
@@ -4131,14 +4264,14 @@
   <w:latentStyles w:defLockedState="0" w:defUIPriority="99" w:defSemiHidden="0" w:defUnhideWhenUsed="0" w:defQFormat="0" w:count="376">
     <w:lsdException w:name="Normal" w:uiPriority="0" w:qFormat="1"/>
     <w:lsdException w:name="heading 1" w:uiPriority="9" w:qFormat="1"/>
-    <w:lsdException w:name="heading 2" w:semiHidden="1" w:uiPriority="9" w:unhideWhenUsed="1" w:qFormat="1"/>
-    <w:lsdException w:name="heading 3" w:semiHidden="1" w:uiPriority="9" w:unhideWhenUsed="1" w:qFormat="1"/>
-    <w:lsdException w:name="heading 4" w:semiHidden="1" w:uiPriority="9" w:unhideWhenUsed="1" w:qFormat="1"/>
-    <w:lsdException w:name="heading 5" w:semiHidden="1" w:uiPriority="9" w:unhideWhenUsed="1" w:qFormat="1"/>
-    <w:lsdException w:name="heading 6" w:semiHidden="1" w:uiPriority="9" w:unhideWhenUsed="1" w:qFormat="1"/>
-    <w:lsdException w:name="heading 7" w:semiHidden="1" w:uiPriority="9" w:unhideWhenUsed="1" w:qFormat="1"/>
-    <w:lsdException w:name="heading 8" w:semiHidden="1" w:uiPriority="9" w:unhideWhenUsed="1" w:qFormat="1"/>
-    <w:lsdException w:name="heading 9" w:semiHidden="1" w:uiPriority="9" w:unhideWhenUsed="1" w:qFormat="1"/>
+    <w:lsdException w:name="heading 2" w:uiPriority="9" w:semiHidden="1" w:unhideWhenUsed="1" w:qFormat="1"/>
+    <w:lsdException w:name="heading 3" w:uiPriority="9" w:semiHidden="1" w:unhideWhenUsed="1" w:qFormat="1"/>
+    <w:lsdException w:name="heading 4" w:uiPriority="9" w:semiHidden="1" w:unhideWhenUsed="1" w:qFormat="1"/>
+    <w:lsdException w:name="heading 5" w:uiPriority="9" w:semiHidden="1" w:unhideWhenUsed="1" w:qFormat="1"/>
+    <w:lsdException w:name="heading 6" w:uiPriority="9" w:semiHidden="1" w:unhideWhenUsed="1" w:qFormat="1"/>
+    <w:lsdException w:name="heading 7" w:uiPriority="9" w:semiHidden="1" w:unhideWhenUsed="1" w:qFormat="1"/>
+    <w:lsdException w:name="heading 8" w:uiPriority="9" w:semiHidden="1" w:unhideWhenUsed="1" w:qFormat="1"/>
+    <w:lsdException w:name="heading 9" w:uiPriority="9" w:semiHidden="1" w:unhideWhenUsed="1" w:qFormat="1"/>
     <w:lsdException w:name="index 1" w:semiHidden="1" w:unhideWhenUsed="1"/>
     <w:lsdException w:name="index 2" w:semiHidden="1" w:unhideWhenUsed="1"/>
     <w:lsdException w:name="index 3" w:semiHidden="1" w:unhideWhenUsed="1"/>
@@ -4148,22 +4281,22 @@
     <w:lsdException w:name="index 7" w:semiHidden="1" w:unhideWhenUsed="1"/>
     <w:lsdException w:name="index 8" w:semiHidden="1" w:unhideWhenUsed="1"/>
     <w:lsdException w:name="index 9" w:semiHidden="1" w:unhideWhenUsed="1"/>
-    <w:lsdException w:name="toc 1" w:semiHidden="1" w:uiPriority="39" w:unhideWhenUsed="1"/>
-    <w:lsdException w:name="toc 2" w:semiHidden="1" w:uiPriority="39" w:unhideWhenUsed="1"/>
-    <w:lsdException w:name="toc 3" w:semiHidden="1" w:uiPriority="39" w:unhideWhenUsed="1"/>
-    <w:lsdException w:name="toc 4" w:semiHidden="1" w:uiPriority="39" w:unhideWhenUsed="1"/>
-    <w:lsdException w:name="toc 5" w:semiHidden="1" w:uiPriority="39" w:unhideWhenUsed="1"/>
-    <w:lsdException w:name="toc 6" w:semiHidden="1" w:uiPriority="39" w:unhideWhenUsed="1"/>
-    <w:lsdException w:name="toc 7" w:semiHidden="1" w:uiPriority="39" w:unhideWhenUsed="1"/>
-    <w:lsdException w:name="toc 8" w:semiHidden="1" w:uiPriority="39" w:unhideWhenUsed="1"/>
-    <w:lsdException w:name="toc 9" w:semiHidden="1" w:uiPriority="39" w:unhideWhenUsed="1"/>
+    <w:lsdException w:name="toc 1" w:uiPriority="39" w:semiHidden="1" w:unhideWhenUsed="1"/>
+    <w:lsdException w:name="toc 2" w:uiPriority="39" w:semiHidden="1" w:unhideWhenUsed="1"/>
+    <w:lsdException w:name="toc 3" w:uiPriority="39" w:semiHidden="1" w:unhideWhenUsed="1"/>
+    <w:lsdException w:name="toc 4" w:uiPriority="39" w:semiHidden="1" w:unhideWhenUsed="1"/>
+    <w:lsdException w:name="toc 5" w:uiPriority="39" w:semiHidden="1" w:unhideWhenUsed="1"/>
+    <w:lsdException w:name="toc 6" w:uiPriority="39" w:semiHidden="1" w:unhideWhenUsed="1"/>
+    <w:lsdException w:name="toc 7" w:uiPriority="39" w:semiHidden="1" w:unhideWhenUsed="1"/>
+    <w:lsdException w:name="toc 8" w:uiPriority="39" w:semiHidden="1" w:unhideWhenUsed="1"/>
+    <w:lsdException w:name="toc 9" w:uiPriority="39" w:semiHidden="1" w:unhideWhenUsed="1"/>
     <w:lsdException w:name="Normal Indent" w:semiHidden="1" w:unhideWhenUsed="1"/>
     <w:lsdException w:name="footnote text" w:semiHidden="1" w:unhideWhenUsed="1"/>
     <w:lsdException w:name="annotation text" w:semiHidden="1" w:unhideWhenUsed="1"/>
     <w:lsdException w:name="header" w:semiHidden="1" w:unhideWhenUsed="1"/>
     <w:lsdException w:name="footer" w:semiHidden="1" w:unhideWhenUsed="1"/>
     <w:lsdException w:name="index heading" w:semiHidden="1" w:unhideWhenUsed="1"/>
-    <w:lsdException w:name="caption" w:semiHidden="1" w:uiPriority="35" w:unhideWhenUsed="1" w:qFormat="1"/>
+    <w:lsdException w:name="caption" w:uiPriority="35" w:semiHidden="1" w:unhideWhenUsed="1" w:qFormat="1"/>
     <w:lsdException w:name="table of figures" w:semiHidden="1" w:unhideWhenUsed="1"/>
     <w:lsdException w:name="envelope address" w:semiHidden="1" w:unhideWhenUsed="1"/>
     <w:lsdException w:name="envelope return" w:semiHidden="1" w:unhideWhenUsed="1"/>
@@ -4194,7 +4327,7 @@
     <w:lsdException w:name="Title" w:uiPriority="10" w:qFormat="1"/>
     <w:lsdException w:name="Closing" w:semiHidden="1" w:unhideWhenUsed="1"/>
     <w:lsdException w:name="Signature" w:semiHidden="1" w:unhideWhenUsed="1"/>
-    <w:lsdException w:name="Default Paragraph Font" w:semiHidden="1" w:uiPriority="1" w:unhideWhenUsed="1"/>
+    <w:lsdException w:name="Default Paragraph Font" w:uiPriority="1" w:semiHidden="1" w:unhideWhenUsed="1"/>
     <w:lsdException w:name="Body Text" w:semiHidden="1" w:unhideWhenUsed="1"/>
     <w:lsdException w:name="Body Text Indent" w:semiHidden="1" w:unhideWhenUsed="1"/>
     <w:lsdException w:name="List Continue" w:semiHidden="1" w:unhideWhenUsed="1"/>
@@ -4394,8 +4527,8 @@
     <w:lsdException w:name="Subtle Reference" w:uiPriority="31" w:qFormat="1"/>
     <w:lsdException w:name="Intense Reference" w:uiPriority="32" w:qFormat="1"/>
     <w:lsdException w:name="Book Title" w:uiPriority="33" w:qFormat="1"/>
-    <w:lsdException w:name="Bibliography" w:semiHidden="1" w:uiPriority="37" w:unhideWhenUsed="1"/>
-    <w:lsdException w:name="TOC Heading" w:semiHidden="1" w:uiPriority="39" w:unhideWhenUsed="1" w:qFormat="1"/>
+    <w:lsdException w:name="Bibliography" w:uiPriority="37" w:semiHidden="1" w:unhideWhenUsed="1"/>
+    <w:lsdException w:name="TOC Heading" w:uiPriority="39" w:semiHidden="1" w:unhideWhenUsed="1" w:qFormat="1"/>
     <w:lsdException w:name="Plain Table 1" w:uiPriority="41"/>
     <w:lsdException w:name="Plain Table 2" w:uiPriority="42"/>
     <w:lsdException w:name="Plain Table 3" w:uiPriority="43"/>
@@ -4506,7 +4639,7 @@
     <w:lsdException w:name="Unresolved Mention" w:semiHidden="1" w:unhideWhenUsed="1"/>
     <w:lsdException w:name="Smart Link" w:semiHidden="1" w:unhideWhenUsed="1"/>
   </w:latentStyles>
-  <w:style w:type="paragraph" w:default="1" w:styleId="Normal">
+  <w:style w:type="paragraph" w:styleId="Normal" w:default="1">
     <w:name w:val="Normal"/>
     <w:qFormat/>
   </w:style>
@@ -4545,13 +4678,13 @@
       <w:sz w:val="25"/>
     </w:rPr>
   </w:style>
-  <w:style w:type="character" w:default="1" w:styleId="Fuentedeprrafopredeter">
+  <w:style w:type="character" w:styleId="Fuentedeprrafopredeter" w:default="1">
     <w:name w:val="Default Paragraph Font"/>
     <w:uiPriority w:val="1"/>
     <w:semiHidden/>
     <w:unhideWhenUsed/>
   </w:style>
-  <w:style w:type="table" w:default="1" w:styleId="Tablanormal">
+  <w:style w:type="table" w:styleId="Tablanormal" w:default="1">
     <w:name w:val="Normal Table"/>
     <w:uiPriority w:val="99"/>
     <w:semiHidden/>
@@ -4566,7 +4699,7 @@
       </w:tblCellMar>
     </w:tblPr>
   </w:style>
-  <w:style w:type="numbering" w:default="1" w:styleId="Sinlista">
+  <w:style w:type="numbering" w:styleId="Sinlista" w:default="1">
     <w:name w:val="No List"/>
     <w:uiPriority w:val="99"/>
     <w:semiHidden/>
@@ -4599,7 +4732,7 @@
       <w:sz w:val="30"/>
     </w:rPr>
   </w:style>
-  <w:style w:type="paragraph" w:customStyle="1" w:styleId="Code">
+  <w:style w:type="paragraph" w:styleId="Code" w:customStyle="1">
     <w:name w:val="Code"/>
     <w:basedOn w:val="Normal"/>
     <w:pPr>
@@ -4615,7 +4748,7 @@
 </file>
 
 <file path=word/theme/theme1.xml><?xml version="1.0" encoding="utf-8"?>
-<a:theme xmlns:a="http://schemas.openxmlformats.org/drawingml/2006/main" name="Tema de Office">
+<a:theme xmlns:a="http://schemas.openxmlformats.org/drawingml/2006/main" xmlns:thm15="http://schemas.microsoft.com/office/thememl/2012/main" name="Tema de Office">
   <a:themeElements>
     <a:clrScheme name="Office">
       <a:dk1>

</xml_diff>